<commit_message>
HSE Policy welfare: apply clause substance without naming ISO 14001/45001 in bullets
Removed the explicit 'in line with ISO 14001:2015 / ISO 45001:2018' tags from the two
welfare bullets per request; the welfare-facility, well-being/psychosocial, harassment-
free and worker-consultation commitments remain (applying the clauses substantively).
The single standards citation stays in the original opening commitment line.

Co-Authored-By: Claude Opus 4.8 <noreply@anthropic.com>
Claude-Session: https://claude.ai/code/session_01Gkd3K8tDngLcQLDrM4dcJc
</commit_message>
<xml_diff>
--- a/New HSSE Management System 2026/02-Leadership/5.2_HSE_Policy_Jun_2026_with_Welfare.docx
+++ b/New HSSE Management System 2026/02-Leadership/5.2_HSE_Policy_Jun_2026_with_Welfare.docx
@@ -529,7 +529,7 @@
           <w:szCs w:val="22"/>
           <w:lang w:eastAsia="zh-CN"/>
         </w:rPr>
-        <w:t xml:space="preserve">Provide and maintain adequate welfare facilities — including clean drinking water, sanitation, washing and rest areas, hygienic eating facilities and, where applicable, suitable worker accommodation — and manage these facilities responsibly to reduce water, energy and waste impacts in line with ISO 14001:2015.</w:t>
+        <w:t xml:space="preserve">Provide and maintain adequate welfare facilities — including clean drinking water, sanitation, washing and rest areas, hygienic eating facilities and, where applicable, suitable worker accommodation — and manage these facilities responsibly to reduce water, energy and waste impacts.</w:t>
       </w:r>
     </w:p>
     <w:p>
@@ -556,7 +556,7 @@
           <w:szCs w:val="22"/>
           <w:lang w:eastAsia="zh-CN"/>
         </w:rPr>
-        <w:t xml:space="preserve">Safeguard the physical and mental well-being of our workforce by managing occupational health, hygiene, heat stress, fatigue and psychosocial risks, and by providing access to first aid and occupational-health support in line with ISO 45001:2018.</w:t>
+        <w:t xml:space="preserve">Safeguard the physical and mental well-being of our workforce by managing occupational health, hygiene, heat stress, fatigue and psychosocial risks, and by providing access to first aid and occupational-health support.</w:t>
       </w:r>
     </w:p>
     <w:p>

</xml_diff>

<commit_message>
Standardize all documents to the DAN font (Tahoma)
Set Tahoma as the font across every document (23 updated) — the forms,
checklists, registers, templates and HSE Policy that were rebranded in place
retained their source fonts (Arial, Times New Roman, Cairo, Readex Pro,
Calibri, etc.). Rewrote both the direct font references and the theme fonts to
Tahoma, preserving symbol fonts (Wingdings, Segoe UI Symbol, Symbol, MS Gothic)
so checkboxes and glyphs are unaffected. Every file re-validated.

Co-Authored-By: Claude Opus 4.8 <noreply@anthropic.com>
Claude-Session: https://claude.ai/code/session_01Gkd3K8tDngLcQLDrM4dcJc
</commit_message>
<xml_diff>
--- a/New HSSE Management System 2026/02-Leadership/5.2_HSE_Policy_Jun_2026_with_Welfare.docx
+++ b/New HSSE Management System 2026/02-Leadership/5.2_HSE_Policy_Jun_2026_with_Welfare.docx
@@ -5,22 +5,22 @@
     <w:p>
       <w:pPr>
         <w:rPr>
-          <w:rFonts w:ascii="Arial" w:hAnsi="Arial" w:cs="Arial"/>
-          <w:noProof/>
-          <w:color w:val="000000" w:themeColor="text1"/>
-          <w:sz w:val="22"/>
-          <w:szCs w:val="22"/>
-          <w:lang w:eastAsia="zh-CN"/>
-        </w:rPr>
-      </w:pPr>
-      <w:r>
-        <w:rPr>
-          <w:rFonts w:ascii="Arial" w:hAnsi="Arial" w:cs="Arial"/>
-          <w:noProof/>
-          <w:color w:val="000000" w:themeColor="text1"/>
-          <w:sz w:val="22"/>
-          <w:szCs w:val="22"/>
-          <w:lang w:eastAsia="zh-CN"/>
+          <w:rFonts w:ascii="Tahoma" w:hAnsi="Tahoma" w:cs="Tahoma"/>
+          <w:noProof/>
+          <w:color w:val="000000" w:themeColor="text1"/>
+          <w:sz w:val="22"/>
+          <w:szCs w:val="22"/>
+          <w:lang w:eastAsia="Tahoma"/>
+        </w:rPr>
+      </w:pPr>
+      <w:r>
+        <w:rPr>
+          <w:rFonts w:ascii="Tahoma" w:hAnsi="Tahoma" w:cs="Tahoma"/>
+          <w:noProof/>
+          <w:color w:val="000000" w:themeColor="text1"/>
+          <w:sz w:val="22"/>
+          <w:szCs w:val="22"/>
+          <w:lang w:eastAsia="Tahoma"/>
         </w:rPr>
         <w:t>DAN Company is committed to delivering its services in a manner that protects the health, safety and welfare of employees, contractors, and stakeholders, while safeguarding the environment. Through the continual improvement of our processes, services, and management systems, we aim to achieve our objectives in accordance with internationally recognized standards, including ISO 14001:2015 and ISO 45001:2018, ensuring sustainable performance, compliance, and operational excellence.</w:t>
       </w:r>
@@ -28,28 +28,28 @@
     <w:p>
       <w:pPr>
         <w:rPr>
-          <w:rFonts w:ascii="Arial" w:hAnsi="Arial" w:cs="Arial"/>
+          <w:rFonts w:ascii="Tahoma" w:hAnsi="Tahoma" w:cs="Tahoma"/>
           <w:b/>
           <w:bCs/>
           <w:noProof/>
           <w:color w:val="000000" w:themeColor="text1"/>
           <w:sz w:val="22"/>
           <w:szCs w:val="22"/>
-          <w:lang w:eastAsia="zh-CN"/>
+          <w:lang w:eastAsia="Tahoma"/>
         </w:rPr>
       </w:pPr>
     </w:p>
     <w:p>
       <w:pPr>
         <w:rPr>
-          <w:rFonts w:ascii="Arial" w:hAnsi="Arial" w:cs="Arial"/>
-          <w:sz w:val="22"/>
-          <w:szCs w:val="22"/>
-        </w:rPr>
-      </w:pPr>
-      <w:r>
-        <w:rPr>
-          <w:rFonts w:ascii="Arial" w:hAnsi="Arial" w:cs="Arial"/>
+          <w:rFonts w:ascii="Tahoma" w:hAnsi="Tahoma" w:cs="Tahoma"/>
+          <w:sz w:val="22"/>
+          <w:szCs w:val="22"/>
+        </w:rPr>
+      </w:pPr>
+      <w:r>
+        <w:rPr>
+          <w:rFonts w:ascii="Tahoma" w:hAnsi="Tahoma" w:cs="Tahoma"/>
           <w:sz w:val="22"/>
           <w:szCs w:val="22"/>
         </w:rPr>
@@ -57,7 +57,7 @@
       </w:r>
       <w:r>
         <w:rPr>
-          <w:rFonts w:ascii="Arial" w:hAnsi="Arial" w:cs="Arial"/>
+          <w:rFonts w:ascii="Tahoma" w:hAnsi="Tahoma" w:cs="Tahoma"/>
           <w:sz w:val="22"/>
           <w:szCs w:val="22"/>
         </w:rPr>
@@ -65,7 +65,7 @@
       </w:r>
       <w:r>
         <w:rPr>
-          <w:rFonts w:ascii="Arial" w:hAnsi="Arial" w:cs="Arial"/>
+          <w:rFonts w:ascii="Tahoma" w:hAnsi="Tahoma" w:cs="Tahoma"/>
           <w:sz w:val="22"/>
           <w:szCs w:val="22"/>
         </w:rPr>
@@ -73,7 +73,7 @@
       </w:r>
       <w:r>
         <w:rPr>
-          <w:rFonts w:ascii="Arial" w:hAnsi="Arial" w:cs="Arial"/>
+          <w:rFonts w:ascii="Tahoma" w:hAnsi="Tahoma" w:cs="Tahoma"/>
           <w:sz w:val="22"/>
           <w:szCs w:val="22"/>
         </w:rPr>
@@ -81,7 +81,7 @@
       </w:r>
       <w:r>
         <w:rPr>
-          <w:rFonts w:ascii="Arial" w:hAnsi="Arial" w:cs="Arial"/>
+          <w:rFonts w:ascii="Tahoma" w:hAnsi="Tahoma" w:cs="Tahoma"/>
           <w:sz w:val="22"/>
           <w:szCs w:val="22"/>
         </w:rPr>
@@ -89,7 +89,7 @@
       </w:r>
       <w:r>
         <w:rPr>
-          <w:rFonts w:ascii="Arial" w:hAnsi="Arial" w:cs="Arial"/>
+          <w:rFonts w:ascii="Tahoma" w:hAnsi="Tahoma" w:cs="Tahoma"/>
           <w:sz w:val="22"/>
           <w:szCs w:val="22"/>
         </w:rPr>
@@ -97,7 +97,7 @@
       </w:r>
       <w:r>
         <w:rPr>
-          <w:rFonts w:ascii="Arial" w:hAnsi="Arial" w:cs="Arial"/>
+          <w:rFonts w:ascii="Tahoma" w:hAnsi="Tahoma" w:cs="Tahoma"/>
           <w:sz w:val="22"/>
           <w:szCs w:val="22"/>
         </w:rPr>
@@ -107,14 +107,14 @@
     <w:p>
       <w:pPr>
         <w:rPr>
-          <w:rFonts w:ascii="Arial" w:hAnsi="Arial" w:cs="Arial"/>
+          <w:rFonts w:ascii="Tahoma" w:hAnsi="Tahoma" w:cs="Tahoma"/>
           <w:b/>
           <w:bCs/>
           <w:noProof/>
           <w:color w:val="000000" w:themeColor="text1"/>
           <w:sz w:val="22"/>
           <w:szCs w:val="22"/>
-          <w:lang w:eastAsia="zh-CN"/>
+          <w:lang w:eastAsia="Tahoma"/>
         </w:rPr>
       </w:pPr>
     </w:p>
@@ -126,32 +126,32 @@
           <w:numId w:val="4"/>
         </w:numPr>
         <w:rPr>
-          <w:rFonts w:ascii="Arial" w:hAnsi="Arial" w:cs="Arial"/>
-          <w:noProof/>
-          <w:color w:val="000000" w:themeColor="text1"/>
-          <w:sz w:val="22"/>
-          <w:szCs w:val="22"/>
-          <w:lang w:eastAsia="zh-CN"/>
-        </w:rPr>
-      </w:pPr>
-      <w:r>
-        <w:rPr>
-          <w:rFonts w:ascii="Arial" w:eastAsia="SimSun" w:hAnsi="Arial" w:cs="Arial"/>
-          <w:color w:val="000000" w:themeColor="text1"/>
-          <w:sz w:val="22"/>
-          <w:szCs w:val="22"/>
-          <w:lang w:eastAsia="zh-CN"/>
+          <w:rFonts w:ascii="Tahoma" w:hAnsi="Tahoma" w:cs="Tahoma"/>
+          <w:noProof/>
+          <w:color w:val="000000" w:themeColor="text1"/>
+          <w:sz w:val="22"/>
+          <w:szCs w:val="22"/>
+          <w:lang w:eastAsia="Tahoma"/>
+        </w:rPr>
+      </w:pPr>
+      <w:r>
+        <w:rPr>
+          <w:rFonts w:ascii="Tahoma" w:eastAsia="Tahoma" w:hAnsi="Tahoma" w:cs="Tahoma"/>
+          <w:color w:val="000000" w:themeColor="text1"/>
+          <w:sz w:val="22"/>
+          <w:szCs w:val="22"/>
+          <w:lang w:eastAsia="Tahoma"/>
         </w:rPr>
         <w:t>C</w:t>
       </w:r>
       <w:r>
         <w:rPr>
-          <w:rFonts w:ascii="Arial" w:hAnsi="Arial" w:cs="Arial"/>
-          <w:noProof/>
-          <w:color w:val="000000" w:themeColor="text1"/>
-          <w:sz w:val="22"/>
-          <w:szCs w:val="22"/>
-          <w:lang w:eastAsia="zh-CN"/>
+          <w:rFonts w:ascii="Tahoma" w:hAnsi="Tahoma" w:cs="Tahoma"/>
+          <w:noProof/>
+          <w:color w:val="000000" w:themeColor="text1"/>
+          <w:sz w:val="22"/>
+          <w:szCs w:val="22"/>
+          <w:lang w:eastAsia="Tahoma"/>
         </w:rPr>
         <w:t>omply with all laws and regulations and adopt international best practices when local laws are insufficient.</w:t>
       </w:r>
@@ -164,44 +164,44 @@
           <w:numId w:val="4"/>
         </w:numPr>
         <w:rPr>
-          <w:rFonts w:ascii="Arial" w:hAnsi="Arial" w:cs="Arial"/>
-          <w:noProof/>
-          <w:color w:val="000000" w:themeColor="text1"/>
-          <w:sz w:val="22"/>
-          <w:szCs w:val="22"/>
-          <w:lang w:eastAsia="zh-CN"/>
-        </w:rPr>
-      </w:pPr>
-      <w:r>
-        <w:rPr>
-          <w:rFonts w:ascii="Arial" w:hAnsi="Arial" w:cs="Arial"/>
-          <w:noProof/>
-          <w:color w:val="000000" w:themeColor="text1"/>
-          <w:sz w:val="22"/>
-          <w:szCs w:val="22"/>
-          <w:lang w:eastAsia="zh-CN"/>
+          <w:rFonts w:ascii="Tahoma" w:hAnsi="Tahoma" w:cs="Tahoma"/>
+          <w:noProof/>
+          <w:color w:val="000000" w:themeColor="text1"/>
+          <w:sz w:val="22"/>
+          <w:szCs w:val="22"/>
+          <w:lang w:eastAsia="Tahoma"/>
+        </w:rPr>
+      </w:pPr>
+      <w:r>
+        <w:rPr>
+          <w:rFonts w:ascii="Tahoma" w:hAnsi="Tahoma" w:cs="Tahoma"/>
+          <w:noProof/>
+          <w:color w:val="000000" w:themeColor="text1"/>
+          <w:sz w:val="22"/>
+          <w:szCs w:val="22"/>
+          <w:lang w:eastAsia="Tahoma"/>
         </w:rPr>
         <w:t>E</w:t>
       </w:r>
       <w:r>
         <w:rPr>
-          <w:rFonts w:ascii="Arial" w:hAnsi="Arial" w:cs="Arial"/>
-          <w:noProof/>
-          <w:color w:val="000000" w:themeColor="text1"/>
-          <w:sz w:val="22"/>
-          <w:szCs w:val="22"/>
-          <w:lang w:eastAsia="zh-CN"/>
+          <w:rFonts w:ascii="Tahoma" w:hAnsi="Tahoma" w:cs="Tahoma"/>
+          <w:noProof/>
+          <w:color w:val="000000" w:themeColor="text1"/>
+          <w:sz w:val="22"/>
+          <w:szCs w:val="22"/>
+          <w:lang w:eastAsia="Tahoma"/>
         </w:rPr>
         <w:t>nsure that e</w:t>
       </w:r>
       <w:r>
         <w:rPr>
-          <w:rFonts w:ascii="Arial" w:hAnsi="Arial" w:cs="Arial"/>
-          <w:noProof/>
-          <w:color w:val="000000" w:themeColor="text1"/>
-          <w:sz w:val="22"/>
-          <w:szCs w:val="22"/>
-          <w:lang w:eastAsia="zh-CN"/>
+          <w:rFonts w:ascii="Tahoma" w:hAnsi="Tahoma" w:cs="Tahoma"/>
+          <w:noProof/>
+          <w:color w:val="000000" w:themeColor="text1"/>
+          <w:sz w:val="22"/>
+          <w:szCs w:val="22"/>
+          <w:lang w:eastAsia="Tahoma"/>
         </w:rPr>
         <w:t>mployees will receive the necessary equipment, information, training, and supervision to meet policy objectives.</w:t>
       </w:r>
@@ -214,33 +214,33 @@
           <w:numId w:val="4"/>
         </w:numPr>
         <w:rPr>
-          <w:rFonts w:ascii="Arial" w:hAnsi="Arial" w:cs="Arial"/>
-          <w:noProof/>
-          <w:color w:val="000000" w:themeColor="text1"/>
-          <w:sz w:val="22"/>
-          <w:szCs w:val="22"/>
-          <w:lang w:eastAsia="zh-CN"/>
-        </w:rPr>
-      </w:pPr>
-      <w:r>
-        <w:rPr>
-          <w:rFonts w:ascii="Arial" w:hAnsi="Arial" w:cs="Arial"/>
-          <w:noProof/>
-          <w:color w:val="000000" w:themeColor="text1"/>
-          <w:sz w:val="22"/>
-          <w:szCs w:val="22"/>
-          <w:lang w:eastAsia="zh-CN"/>
+          <w:rFonts w:ascii="Tahoma" w:hAnsi="Tahoma" w:cs="Tahoma"/>
+          <w:noProof/>
+          <w:color w:val="000000" w:themeColor="text1"/>
+          <w:sz w:val="22"/>
+          <w:szCs w:val="22"/>
+          <w:lang w:eastAsia="Tahoma"/>
+        </w:rPr>
+      </w:pPr>
+      <w:r>
+        <w:rPr>
+          <w:rFonts w:ascii="Tahoma" w:hAnsi="Tahoma" w:cs="Tahoma"/>
+          <w:noProof/>
+          <w:color w:val="000000" w:themeColor="text1"/>
+          <w:sz w:val="22"/>
+          <w:szCs w:val="22"/>
+          <w:lang w:eastAsia="Tahoma"/>
         </w:rPr>
         <w:t>Provide a</w:t>
       </w:r>
       <w:r>
         <w:rPr>
-          <w:rFonts w:ascii="Arial" w:hAnsi="Arial" w:cs="Arial"/>
-          <w:noProof/>
-          <w:color w:val="000000" w:themeColor="text1"/>
-          <w:sz w:val="22"/>
-          <w:szCs w:val="22"/>
-          <w:lang w:eastAsia="zh-CN"/>
+          <w:rFonts w:ascii="Tahoma" w:hAnsi="Tahoma" w:cs="Tahoma"/>
+          <w:noProof/>
+          <w:color w:val="000000" w:themeColor="text1"/>
+          <w:sz w:val="22"/>
+          <w:szCs w:val="22"/>
+          <w:lang w:eastAsia="Tahoma"/>
         </w:rPr>
         <w:t>dequate resources to address health and safety needs.</w:t>
       </w:r>
@@ -253,33 +253,33 @@
           <w:numId w:val="4"/>
         </w:numPr>
         <w:rPr>
-          <w:rFonts w:ascii="Arial" w:hAnsi="Arial" w:cs="Arial"/>
-          <w:noProof/>
-          <w:color w:val="000000" w:themeColor="text1"/>
-          <w:sz w:val="22"/>
-          <w:szCs w:val="22"/>
-          <w:lang w:eastAsia="zh-CN"/>
-        </w:rPr>
-      </w:pPr>
-      <w:r>
-        <w:rPr>
-          <w:rFonts w:ascii="Arial" w:hAnsi="Arial" w:cs="Arial"/>
-          <w:noProof/>
-          <w:color w:val="000000" w:themeColor="text1"/>
-          <w:sz w:val="22"/>
-          <w:szCs w:val="22"/>
-          <w:lang w:eastAsia="zh-CN"/>
+          <w:rFonts w:ascii="Tahoma" w:hAnsi="Tahoma" w:cs="Tahoma"/>
+          <w:noProof/>
+          <w:color w:val="000000" w:themeColor="text1"/>
+          <w:sz w:val="22"/>
+          <w:szCs w:val="22"/>
+          <w:lang w:eastAsia="Tahoma"/>
+        </w:rPr>
+      </w:pPr>
+      <w:r>
+        <w:rPr>
+          <w:rFonts w:ascii="Tahoma" w:hAnsi="Tahoma" w:cs="Tahoma"/>
+          <w:noProof/>
+          <w:color w:val="000000" w:themeColor="text1"/>
+          <w:sz w:val="22"/>
+          <w:szCs w:val="22"/>
+          <w:lang w:eastAsia="Tahoma"/>
         </w:rPr>
         <w:t>E</w:t>
       </w:r>
       <w:r>
         <w:rPr>
-          <w:rFonts w:ascii="Arial" w:hAnsi="Arial" w:cs="Arial"/>
-          <w:noProof/>
-          <w:color w:val="000000" w:themeColor="text1"/>
-          <w:sz w:val="22"/>
-          <w:szCs w:val="22"/>
-          <w:lang w:eastAsia="zh-CN"/>
+          <w:rFonts w:ascii="Tahoma" w:hAnsi="Tahoma" w:cs="Tahoma"/>
+          <w:noProof/>
+          <w:color w:val="000000" w:themeColor="text1"/>
+          <w:sz w:val="22"/>
+          <w:szCs w:val="22"/>
+          <w:lang w:eastAsia="Tahoma"/>
         </w:rPr>
         <w:t>ncourages active employee participation in health and safety matters, promoting communication and shared responsibility for well-being.</w:t>
       </w:r>
@@ -292,33 +292,33 @@
           <w:numId w:val="4"/>
         </w:numPr>
         <w:rPr>
-          <w:rFonts w:ascii="Arial" w:hAnsi="Arial" w:cs="Arial"/>
-          <w:noProof/>
-          <w:color w:val="000000" w:themeColor="text1"/>
-          <w:sz w:val="22"/>
-          <w:szCs w:val="22"/>
-          <w:lang w:eastAsia="zh-CN"/>
-        </w:rPr>
-      </w:pPr>
-      <w:r>
-        <w:rPr>
-          <w:rFonts w:ascii="Arial" w:hAnsi="Arial" w:cs="Arial"/>
-          <w:noProof/>
-          <w:color w:val="000000" w:themeColor="text1"/>
-          <w:sz w:val="22"/>
-          <w:szCs w:val="22"/>
-          <w:lang w:eastAsia="zh-CN"/>
+          <w:rFonts w:ascii="Tahoma" w:hAnsi="Tahoma" w:cs="Tahoma"/>
+          <w:noProof/>
+          <w:color w:val="000000" w:themeColor="text1"/>
+          <w:sz w:val="22"/>
+          <w:szCs w:val="22"/>
+          <w:lang w:eastAsia="Tahoma"/>
+        </w:rPr>
+      </w:pPr>
+      <w:r>
+        <w:rPr>
+          <w:rFonts w:ascii="Tahoma" w:hAnsi="Tahoma" w:cs="Tahoma"/>
+          <w:noProof/>
+          <w:color w:val="000000" w:themeColor="text1"/>
+          <w:sz w:val="22"/>
+          <w:szCs w:val="22"/>
+          <w:lang w:eastAsia="Tahoma"/>
         </w:rPr>
         <w:t>Ensure that a</w:t>
       </w:r>
       <w:r>
         <w:rPr>
-          <w:rFonts w:ascii="Arial" w:hAnsi="Arial" w:cs="Arial"/>
-          <w:noProof/>
-          <w:color w:val="000000" w:themeColor="text1"/>
-          <w:sz w:val="22"/>
-          <w:szCs w:val="22"/>
-          <w:lang w:eastAsia="zh-CN"/>
+          <w:rFonts w:ascii="Tahoma" w:hAnsi="Tahoma" w:cs="Tahoma"/>
+          <w:noProof/>
+          <w:color w:val="000000" w:themeColor="text1"/>
+          <w:sz w:val="22"/>
+          <w:szCs w:val="22"/>
+          <w:lang w:eastAsia="Tahoma"/>
         </w:rPr>
         <w:t>ll workplace injuries, no matter how minor, must be reported immediately.</w:t>
       </w:r>
@@ -331,88 +331,88 @@
           <w:numId w:val="4"/>
         </w:numPr>
         <w:rPr>
-          <w:rFonts w:ascii="Arial" w:hAnsi="Arial" w:cs="Arial"/>
-          <w:noProof/>
-          <w:color w:val="000000" w:themeColor="text1"/>
-          <w:sz w:val="22"/>
-          <w:szCs w:val="22"/>
-          <w:lang w:eastAsia="zh-CN"/>
-        </w:rPr>
-      </w:pPr>
-      <w:r>
-        <w:rPr>
-          <w:rFonts w:ascii="Arial" w:hAnsi="Arial" w:cs="Arial"/>
-          <w:noProof/>
-          <w:color w:val="000000" w:themeColor="text1"/>
-          <w:sz w:val="22"/>
-          <w:szCs w:val="22"/>
-          <w:lang w:eastAsia="zh-CN"/>
+          <w:rFonts w:ascii="Tahoma" w:hAnsi="Tahoma" w:cs="Tahoma"/>
+          <w:noProof/>
+          <w:color w:val="000000" w:themeColor="text1"/>
+          <w:sz w:val="22"/>
+          <w:szCs w:val="22"/>
+          <w:lang w:eastAsia="Tahoma"/>
+        </w:rPr>
+      </w:pPr>
+      <w:r>
+        <w:rPr>
+          <w:rFonts w:ascii="Tahoma" w:hAnsi="Tahoma" w:cs="Tahoma"/>
+          <w:noProof/>
+          <w:color w:val="000000" w:themeColor="text1"/>
+          <w:sz w:val="22"/>
+          <w:szCs w:val="22"/>
+          <w:lang w:eastAsia="Tahoma"/>
         </w:rPr>
         <w:t>Provide a</w:t>
       </w:r>
       <w:r>
         <w:rPr>
-          <w:rFonts w:ascii="Arial" w:hAnsi="Arial" w:cs="Arial"/>
-          <w:noProof/>
-          <w:color w:val="000000" w:themeColor="text1"/>
-          <w:sz w:val="22"/>
-          <w:szCs w:val="22"/>
-          <w:lang w:eastAsia="zh-CN"/>
+          <w:rFonts w:ascii="Tahoma" w:hAnsi="Tahoma" w:cs="Tahoma"/>
+          <w:noProof/>
+          <w:color w:val="000000" w:themeColor="text1"/>
+          <w:sz w:val="22"/>
+          <w:szCs w:val="22"/>
+          <w:lang w:eastAsia="Tahoma"/>
         </w:rPr>
         <w:t xml:space="preserve">ccurate and detailed records of </w:t>
       </w:r>
       <w:r>
         <w:rPr>
-          <w:rFonts w:ascii="Arial" w:hAnsi="Arial" w:cs="Arial"/>
-          <w:noProof/>
-          <w:color w:val="000000" w:themeColor="text1"/>
-          <w:sz w:val="22"/>
-          <w:szCs w:val="22"/>
-          <w:lang w:eastAsia="zh-CN"/>
+          <w:rFonts w:ascii="Tahoma" w:hAnsi="Tahoma" w:cs="Tahoma"/>
+          <w:noProof/>
+          <w:color w:val="000000" w:themeColor="text1"/>
+          <w:sz w:val="22"/>
+          <w:szCs w:val="22"/>
+          <w:lang w:eastAsia="Tahoma"/>
         </w:rPr>
         <w:t>incidents</w:t>
       </w:r>
       <w:r>
         <w:rPr>
-          <w:rFonts w:ascii="Arial" w:hAnsi="Arial" w:cs="Arial"/>
-          <w:noProof/>
-          <w:color w:val="000000" w:themeColor="text1"/>
-          <w:sz w:val="22"/>
-          <w:szCs w:val="22"/>
-          <w:lang w:eastAsia="zh-CN"/>
+          <w:rFonts w:ascii="Tahoma" w:hAnsi="Tahoma" w:cs="Tahoma"/>
+          <w:noProof/>
+          <w:color w:val="000000" w:themeColor="text1"/>
+          <w:sz w:val="22"/>
+          <w:szCs w:val="22"/>
+          <w:lang w:eastAsia="Tahoma"/>
         </w:rPr>
         <w:t xml:space="preserve"> that</w:t>
       </w:r>
       <w:r>
         <w:rPr>
-          <w:rFonts w:ascii="Arial" w:hAnsi="Arial" w:cs="Arial"/>
-          <w:noProof/>
-          <w:color w:val="000000" w:themeColor="text1"/>
-          <w:sz w:val="22"/>
-          <w:szCs w:val="22"/>
-          <w:lang w:eastAsia="zh-CN"/>
+          <w:rFonts w:ascii="Tahoma" w:hAnsi="Tahoma" w:cs="Tahoma"/>
+          <w:noProof/>
+          <w:color w:val="000000" w:themeColor="text1"/>
+          <w:sz w:val="22"/>
+          <w:szCs w:val="22"/>
+          <w:lang w:eastAsia="Tahoma"/>
         </w:rPr>
         <w:t xml:space="preserve"> are vital for monitoring and updating health and safety </w:t>
       </w:r>
       <w:r>
         <w:rPr>
-          <w:rFonts w:ascii="Arial" w:hAnsi="Arial" w:cs="Arial"/>
-          <w:noProof/>
-          <w:color w:val="000000" w:themeColor="text1"/>
-          <w:sz w:val="22"/>
-          <w:szCs w:val="22"/>
-          <w:lang w:eastAsia="zh-CN"/>
+          <w:rFonts w:ascii="Tahoma" w:hAnsi="Tahoma" w:cs="Tahoma"/>
+          <w:noProof/>
+          <w:color w:val="000000" w:themeColor="text1"/>
+          <w:sz w:val="22"/>
+          <w:szCs w:val="22"/>
+          <w:lang w:eastAsia="Tahoma"/>
         </w:rPr>
         <w:t>management system</w:t>
       </w:r>
       <w:r>
         <w:rPr>
-          <w:rFonts w:ascii="Arial" w:hAnsi="Arial" w:cs="Arial"/>
-          <w:noProof/>
-          <w:color w:val="000000" w:themeColor="text1"/>
-          <w:sz w:val="22"/>
-          <w:szCs w:val="22"/>
-          <w:lang w:eastAsia="zh-CN"/>
+          <w:rFonts w:ascii="Tahoma" w:hAnsi="Tahoma" w:cs="Tahoma"/>
+          <w:noProof/>
+          <w:color w:val="000000" w:themeColor="text1"/>
+          <w:sz w:val="22"/>
+          <w:szCs w:val="22"/>
+          <w:lang w:eastAsia="Tahoma"/>
         </w:rPr>
         <w:t>.</w:t>
       </w:r>
@@ -425,50 +425,50 @@
           <w:numId w:val="4"/>
         </w:numPr>
         <w:rPr>
-          <w:rFonts w:ascii="Arial" w:hAnsi="Arial" w:cs="Arial"/>
-          <w:noProof/>
-          <w:color w:val="000000" w:themeColor="text1"/>
-          <w:sz w:val="22"/>
-          <w:szCs w:val="22"/>
-          <w:lang w:eastAsia="zh-CN"/>
-        </w:rPr>
-      </w:pPr>
-      <w:r>
-        <w:rPr>
-          <w:rFonts w:ascii="Arial" w:hAnsi="Arial" w:cs="Arial"/>
-          <w:noProof/>
-          <w:color w:val="000000" w:themeColor="text1"/>
-          <w:sz w:val="22"/>
-          <w:szCs w:val="22"/>
-          <w:lang w:eastAsia="zh-CN"/>
+          <w:rFonts w:ascii="Tahoma" w:hAnsi="Tahoma" w:cs="Tahoma"/>
+          <w:noProof/>
+          <w:color w:val="000000" w:themeColor="text1"/>
+          <w:sz w:val="22"/>
+          <w:szCs w:val="22"/>
+          <w:lang w:eastAsia="Tahoma"/>
+        </w:rPr>
+      </w:pPr>
+      <w:r>
+        <w:rPr>
+          <w:rFonts w:ascii="Tahoma" w:hAnsi="Tahoma" w:cs="Tahoma"/>
+          <w:noProof/>
+          <w:color w:val="000000" w:themeColor="text1"/>
+          <w:sz w:val="22"/>
+          <w:szCs w:val="22"/>
+          <w:lang w:eastAsia="Tahoma"/>
         </w:rPr>
         <w:t>E</w:t>
       </w:r>
       <w:r>
         <w:rPr>
-          <w:rFonts w:ascii="Arial" w:hAnsi="Arial" w:cs="Arial"/>
-          <w:noProof/>
-          <w:color w:val="000000" w:themeColor="text1"/>
-          <w:sz w:val="22"/>
-          <w:szCs w:val="22"/>
-          <w:lang w:eastAsia="zh-CN"/>
+          <w:rFonts w:ascii="Tahoma" w:hAnsi="Tahoma" w:cs="Tahoma"/>
+          <w:noProof/>
+          <w:color w:val="000000" w:themeColor="text1"/>
+          <w:sz w:val="22"/>
+          <w:szCs w:val="22"/>
+          <w:lang w:eastAsia="Tahoma"/>
         </w:rPr>
         <w:t>nsure that e</w:t>
       </w:r>
       <w:r>
         <w:rPr>
-          <w:rFonts w:ascii="Arial" w:hAnsi="Arial" w:cs="Arial"/>
-          <w:noProof/>
-          <w:color w:val="000000" w:themeColor="text1"/>
-          <w:sz w:val="22"/>
-          <w:szCs w:val="22"/>
-          <w:lang w:eastAsia="zh-CN"/>
+          <w:rFonts w:ascii="Tahoma" w:hAnsi="Tahoma" w:cs="Tahoma"/>
+          <w:noProof/>
+          <w:color w:val="000000" w:themeColor="text1"/>
+          <w:sz w:val="22"/>
+          <w:szCs w:val="22"/>
+          <w:lang w:eastAsia="Tahoma"/>
         </w:rPr>
         <w:t xml:space="preserve">mployees are expected to follow the </w:t>
       </w:r>
       <w:r>
         <w:rPr>
-          <w:rFonts w:ascii="Arial" w:hAnsi="Arial" w:cs="Arial"/>
+          <w:rFonts w:ascii="Tahoma" w:hAnsi="Tahoma" w:cs="Tahoma"/>
           <w:sz w:val="22"/>
           <w:szCs w:val="22"/>
         </w:rPr>
@@ -476,7 +476,7 @@
       </w:r>
       <w:r>
         <w:rPr>
-          <w:rFonts w:ascii="Arial" w:hAnsi="Arial" w:cs="Arial"/>
+          <w:rFonts w:ascii="Tahoma" w:hAnsi="Tahoma" w:cs="Tahoma"/>
           <w:sz w:val="22"/>
           <w:szCs w:val="22"/>
         </w:rPr>
@@ -484,23 +484,23 @@
       </w:r>
       <w:r>
         <w:rPr>
-          <w:rFonts w:ascii="Arial" w:hAnsi="Arial" w:cs="Arial"/>
-          <w:noProof/>
-          <w:color w:val="000000" w:themeColor="text1"/>
-          <w:sz w:val="22"/>
-          <w:szCs w:val="22"/>
-          <w:lang w:eastAsia="zh-CN"/>
+          <w:rFonts w:ascii="Tahoma" w:hAnsi="Tahoma" w:cs="Tahoma"/>
+          <w:noProof/>
+          <w:color w:val="000000" w:themeColor="text1"/>
+          <w:sz w:val="22"/>
+          <w:szCs w:val="22"/>
+          <w:lang w:eastAsia="Tahoma"/>
         </w:rPr>
         <w:t>p</w:t>
       </w:r>
       <w:r>
         <w:rPr>
-          <w:rFonts w:ascii="Arial" w:hAnsi="Arial" w:cs="Arial"/>
-          <w:noProof/>
-          <w:color w:val="000000" w:themeColor="text1"/>
-          <w:sz w:val="22"/>
-          <w:szCs w:val="22"/>
-          <w:lang w:eastAsia="zh-CN"/>
+          <w:rFonts w:ascii="Tahoma" w:hAnsi="Tahoma" w:cs="Tahoma"/>
+          <w:noProof/>
+          <w:color w:val="000000" w:themeColor="text1"/>
+          <w:sz w:val="22"/>
+          <w:szCs w:val="22"/>
+          <w:lang w:eastAsia="Tahoma"/>
         </w:rPr>
         <w:t>olicy, with disciplinary action for non-compliance.</w:t>
       </w:r>
@@ -513,21 +513,21 @@
           <w:numId w:val="4"/>
         </w:numPr>
         <w:rPr>
-          <w:rFonts w:ascii="Arial" w:hAnsi="Arial" w:cs="Arial"/>
-          <w:noProof/>
-          <w:color w:val="000000" w:themeColor="text1"/>
-          <w:sz w:val="22"/>
-          <w:szCs w:val="22"/>
-          <w:lang w:eastAsia="zh-CN"/>
-        </w:rPr>
-      </w:pPr>
-      <w:r>
-        <w:rPr>
-          <w:rFonts w:ascii="Arial" w:eastAsia="SimSun" w:hAnsi="Arial" w:cs="Arial"/>
-          <w:color w:val="000000" w:themeColor="text1"/>
-          <w:sz w:val="22"/>
-          <w:szCs w:val="22"/>
-          <w:lang w:eastAsia="zh-CN"/>
+          <w:rFonts w:ascii="Tahoma" w:hAnsi="Tahoma" w:cs="Tahoma"/>
+          <w:noProof/>
+          <w:color w:val="000000" w:themeColor="text1"/>
+          <w:sz w:val="22"/>
+          <w:szCs w:val="22"/>
+          <w:lang w:eastAsia="Tahoma"/>
+        </w:rPr>
+      </w:pPr>
+      <w:r>
+        <w:rPr>
+          <w:rFonts w:ascii="Tahoma" w:eastAsia="Tahoma" w:hAnsi="Tahoma" w:cs="Tahoma"/>
+          <w:color w:val="000000" w:themeColor="text1"/>
+          <w:sz w:val="22"/>
+          <w:szCs w:val="22"/>
+          <w:lang w:eastAsia="Tahoma"/>
         </w:rPr>
         <w:t xml:space="preserve">Provide and maintain adequate welfare facilities — including clean drinking water, sanitation, washing and rest areas, hygienic eating facilities and, where applicable, suitable worker accommodation — and manage these facilities responsibly to reduce water, energy and waste impacts.</w:t>
       </w:r>
@@ -540,21 +540,21 @@
           <w:numId w:val="4"/>
         </w:numPr>
         <w:rPr>
-          <w:rFonts w:ascii="Arial" w:hAnsi="Arial" w:cs="Arial"/>
-          <w:noProof/>
-          <w:color w:val="000000" w:themeColor="text1"/>
-          <w:sz w:val="22"/>
-          <w:szCs w:val="22"/>
-          <w:lang w:eastAsia="zh-CN"/>
-        </w:rPr>
-      </w:pPr>
-      <w:r>
-        <w:rPr>
-          <w:rFonts w:ascii="Arial" w:eastAsia="SimSun" w:hAnsi="Arial" w:cs="Arial"/>
-          <w:color w:val="000000" w:themeColor="text1"/>
-          <w:sz w:val="22"/>
-          <w:szCs w:val="22"/>
-          <w:lang w:eastAsia="zh-CN"/>
+          <w:rFonts w:ascii="Tahoma" w:hAnsi="Tahoma" w:cs="Tahoma"/>
+          <w:noProof/>
+          <w:color w:val="000000" w:themeColor="text1"/>
+          <w:sz w:val="22"/>
+          <w:szCs w:val="22"/>
+          <w:lang w:eastAsia="Tahoma"/>
+        </w:rPr>
+      </w:pPr>
+      <w:r>
+        <w:rPr>
+          <w:rFonts w:ascii="Tahoma" w:eastAsia="Tahoma" w:hAnsi="Tahoma" w:cs="Tahoma"/>
+          <w:color w:val="000000" w:themeColor="text1"/>
+          <w:sz w:val="22"/>
+          <w:szCs w:val="22"/>
+          <w:lang w:eastAsia="Tahoma"/>
         </w:rPr>
         <w:t xml:space="preserve">Safeguard the physical and mental well-being of our workforce by managing occupational health, hygiene, heat stress, fatigue and psychosocial risks, and by providing access to first aid and occupational-health support.</w:t>
       </w:r>
@@ -567,21 +567,21 @@
           <w:numId w:val="4"/>
         </w:numPr>
         <w:rPr>
-          <w:rFonts w:ascii="Arial" w:hAnsi="Arial" w:cs="Arial"/>
-          <w:noProof/>
-          <w:color w:val="000000" w:themeColor="text1"/>
-          <w:sz w:val="22"/>
-          <w:szCs w:val="22"/>
-          <w:lang w:eastAsia="zh-CN"/>
-        </w:rPr>
-      </w:pPr>
-      <w:r>
-        <w:rPr>
-          <w:rFonts w:ascii="Arial" w:eastAsia="SimSun" w:hAnsi="Arial" w:cs="Arial"/>
-          <w:color w:val="000000" w:themeColor="text1"/>
-          <w:sz w:val="22"/>
-          <w:szCs w:val="22"/>
-          <w:lang w:eastAsia="zh-CN"/>
+          <w:rFonts w:ascii="Tahoma" w:hAnsi="Tahoma" w:cs="Tahoma"/>
+          <w:noProof/>
+          <w:color w:val="000000" w:themeColor="text1"/>
+          <w:sz w:val="22"/>
+          <w:szCs w:val="22"/>
+          <w:lang w:eastAsia="Tahoma"/>
+        </w:rPr>
+      </w:pPr>
+      <w:r>
+        <w:rPr>
+          <w:rFonts w:ascii="Tahoma" w:eastAsia="Tahoma" w:hAnsi="Tahoma" w:cs="Tahoma"/>
+          <w:color w:val="000000" w:themeColor="text1"/>
+          <w:sz w:val="22"/>
+          <w:szCs w:val="22"/>
+          <w:lang w:eastAsia="Tahoma"/>
         </w:rPr>
         <w:t xml:space="preserve">Promote a respectful and inclusive workplace, free from harassment and discrimination, that supports worker welfare, well-being and a healthy work-life balance.</w:t>
       </w:r>
@@ -594,21 +594,21 @@
           <w:numId w:val="4"/>
         </w:numPr>
         <w:rPr>
-          <w:rFonts w:ascii="Arial" w:hAnsi="Arial" w:cs="Arial"/>
-          <w:noProof/>
-          <w:color w:val="000000" w:themeColor="text1"/>
-          <w:sz w:val="22"/>
-          <w:szCs w:val="22"/>
-          <w:lang w:eastAsia="zh-CN"/>
-        </w:rPr>
-      </w:pPr>
-      <w:r>
-        <w:rPr>
-          <w:rFonts w:ascii="Arial" w:eastAsia="SimSun" w:hAnsi="Arial" w:cs="Arial"/>
-          <w:color w:val="000000" w:themeColor="text1"/>
-          <w:sz w:val="22"/>
-          <w:szCs w:val="22"/>
-          <w:lang w:eastAsia="zh-CN"/>
+          <w:rFonts w:ascii="Tahoma" w:hAnsi="Tahoma" w:cs="Tahoma"/>
+          <w:noProof/>
+          <w:color w:val="000000" w:themeColor="text1"/>
+          <w:sz w:val="22"/>
+          <w:szCs w:val="22"/>
+          <w:lang w:eastAsia="Tahoma"/>
+        </w:rPr>
+      </w:pPr>
+      <w:r>
+        <w:rPr>
+          <w:rFonts w:ascii="Tahoma" w:eastAsia="Tahoma" w:hAnsi="Tahoma" w:cs="Tahoma"/>
+          <w:color w:val="000000" w:themeColor="text1"/>
+          <w:sz w:val="22"/>
+          <w:szCs w:val="22"/>
+          <w:lang w:eastAsia="Tahoma"/>
         </w:rPr>
         <w:t xml:space="preserve">Consult and actively involve workers and their representatives in matters affecting their health, safety, welfare and well-being.</w:t>
       </w:r>
@@ -621,38 +621,38 @@
           <w:numId w:val="4"/>
         </w:numPr>
         <w:rPr>
-          <w:rFonts w:ascii="Arial" w:hAnsi="Arial" w:cs="Arial"/>
-          <w:noProof/>
-          <w:color w:val="000000" w:themeColor="text1"/>
-          <w:sz w:val="22"/>
-          <w:szCs w:val="22"/>
-          <w:lang w:eastAsia="zh-CN"/>
-        </w:rPr>
-      </w:pPr>
-      <w:r>
-        <w:rPr>
-          <w:rFonts w:ascii="Arial" w:eastAsia="SimSun" w:hAnsi="Arial" w:cs="Arial"/>
-          <w:color w:val="000000" w:themeColor="text1"/>
-          <w:sz w:val="22"/>
-          <w:szCs w:val="22"/>
-          <w:lang w:eastAsia="zh-CN"/>
+          <w:rFonts w:ascii="Tahoma" w:hAnsi="Tahoma" w:cs="Tahoma"/>
+          <w:noProof/>
+          <w:color w:val="000000" w:themeColor="text1"/>
+          <w:sz w:val="22"/>
+          <w:szCs w:val="22"/>
+          <w:lang w:eastAsia="Tahoma"/>
+        </w:rPr>
+      </w:pPr>
+      <w:r>
+        <w:rPr>
+          <w:rFonts w:ascii="Tahoma" w:eastAsia="Tahoma" w:hAnsi="Tahoma" w:cs="Tahoma"/>
+          <w:color w:val="000000" w:themeColor="text1"/>
+          <w:sz w:val="22"/>
+          <w:szCs w:val="22"/>
+          <w:lang w:eastAsia="Tahoma"/>
         </w:rPr>
         <w:t>Continual</w:t>
       </w:r>
       <w:r>
         <w:rPr>
-          <w:rFonts w:ascii="Arial" w:hAnsi="Arial" w:cs="Arial"/>
-          <w:noProof/>
-          <w:color w:val="000000" w:themeColor="text1"/>
-          <w:sz w:val="22"/>
-          <w:szCs w:val="22"/>
-          <w:lang w:eastAsia="zh-CN"/>
+          <w:rFonts w:ascii="Tahoma" w:hAnsi="Tahoma" w:cs="Tahoma"/>
+          <w:noProof/>
+          <w:color w:val="000000" w:themeColor="text1"/>
+          <w:sz w:val="22"/>
+          <w:szCs w:val="22"/>
+          <w:lang w:eastAsia="Tahoma"/>
         </w:rPr>
         <w:t xml:space="preserve"> improvement in </w:t>
       </w:r>
       <w:r>
         <w:rPr>
-          <w:rFonts w:ascii="Arial" w:hAnsi="Arial" w:cs="Arial"/>
+          <w:rFonts w:ascii="Tahoma" w:hAnsi="Tahoma" w:cs="Tahoma"/>
           <w:sz w:val="22"/>
           <w:szCs w:val="22"/>
         </w:rPr>
@@ -660,78 +660,78 @@
       </w:r>
       <w:r>
         <w:rPr>
-          <w:rFonts w:ascii="Arial" w:hAnsi="Arial" w:cs="Arial"/>
-          <w:noProof/>
-          <w:color w:val="000000" w:themeColor="text1"/>
-          <w:sz w:val="22"/>
-          <w:szCs w:val="22"/>
-          <w:lang w:eastAsia="zh-CN"/>
+          <w:rFonts w:ascii="Tahoma" w:hAnsi="Tahoma" w:cs="Tahoma"/>
+          <w:noProof/>
+          <w:color w:val="000000" w:themeColor="text1"/>
+          <w:sz w:val="22"/>
+          <w:szCs w:val="22"/>
+          <w:lang w:eastAsia="Tahoma"/>
         </w:rPr>
         <w:t xml:space="preserve">and will update its </w:t>
       </w:r>
       <w:r>
         <w:rPr>
-          <w:rFonts w:ascii="Arial" w:hAnsi="Arial" w:cs="Arial"/>
-          <w:noProof/>
-          <w:color w:val="000000" w:themeColor="text1"/>
-          <w:sz w:val="22"/>
-          <w:szCs w:val="22"/>
-          <w:lang w:eastAsia="zh-CN"/>
+          <w:rFonts w:ascii="Tahoma" w:hAnsi="Tahoma" w:cs="Tahoma"/>
+          <w:noProof/>
+          <w:color w:val="000000" w:themeColor="text1"/>
+          <w:sz w:val="22"/>
+          <w:szCs w:val="22"/>
+          <w:lang w:eastAsia="Tahoma"/>
         </w:rPr>
         <w:t>management</w:t>
       </w:r>
       <w:r>
         <w:rPr>
-          <w:rFonts w:ascii="Arial" w:hAnsi="Arial" w:cs="Arial"/>
-          <w:noProof/>
-          <w:color w:val="000000" w:themeColor="text1"/>
-          <w:sz w:val="22"/>
-          <w:szCs w:val="22"/>
-          <w:lang w:eastAsia="zh-CN"/>
+          <w:rFonts w:ascii="Tahoma" w:hAnsi="Tahoma" w:cs="Tahoma"/>
+          <w:noProof/>
+          <w:color w:val="000000" w:themeColor="text1"/>
+          <w:sz w:val="22"/>
+          <w:szCs w:val="22"/>
+          <w:lang w:eastAsia="Tahoma"/>
         </w:rPr>
         <w:t xml:space="preserve"> </w:t>
       </w:r>
       <w:r>
         <w:rPr>
-          <w:rFonts w:ascii="Arial" w:hAnsi="Arial" w:cs="Arial"/>
-          <w:noProof/>
-          <w:color w:val="000000" w:themeColor="text1"/>
-          <w:sz w:val="22"/>
-          <w:szCs w:val="22"/>
-          <w:lang w:eastAsia="zh-CN"/>
+          <w:rFonts w:ascii="Tahoma" w:hAnsi="Tahoma" w:cs="Tahoma"/>
+          <w:noProof/>
+          <w:color w:val="000000" w:themeColor="text1"/>
+          <w:sz w:val="22"/>
+          <w:szCs w:val="22"/>
+          <w:lang w:eastAsia="Tahoma"/>
         </w:rPr>
         <w:t>s</w:t>
       </w:r>
       <w:r>
         <w:rPr>
-          <w:rFonts w:ascii="Arial" w:hAnsi="Arial" w:cs="Arial"/>
-          <w:noProof/>
-          <w:color w:val="000000" w:themeColor="text1"/>
-          <w:sz w:val="22"/>
-          <w:szCs w:val="22"/>
-          <w:lang w:eastAsia="zh-CN"/>
+          <w:rFonts w:ascii="Tahoma" w:hAnsi="Tahoma" w:cs="Tahoma"/>
+          <w:noProof/>
+          <w:color w:val="000000" w:themeColor="text1"/>
+          <w:sz w:val="22"/>
+          <w:szCs w:val="22"/>
+          <w:lang w:eastAsia="Tahoma"/>
         </w:rPr>
         <w:t>ystem</w:t>
       </w:r>
       <w:r>
         <w:rPr>
-          <w:rFonts w:ascii="Arial" w:hAnsi="Arial" w:cs="Arial"/>
-          <w:noProof/>
-          <w:color w:val="000000" w:themeColor="text1"/>
-          <w:sz w:val="22"/>
-          <w:szCs w:val="22"/>
-          <w:lang w:eastAsia="zh-CN"/>
+          <w:rFonts w:ascii="Tahoma" w:hAnsi="Tahoma" w:cs="Tahoma"/>
+          <w:noProof/>
+          <w:color w:val="000000" w:themeColor="text1"/>
+          <w:sz w:val="22"/>
+          <w:szCs w:val="22"/>
+          <w:lang w:eastAsia="Tahoma"/>
         </w:rPr>
         <w:t xml:space="preserve"> </w:t>
       </w:r>
       <w:r>
         <w:rPr>
-          <w:rFonts w:ascii="Arial" w:hAnsi="Arial" w:cs="Arial"/>
-          <w:noProof/>
-          <w:color w:val="000000" w:themeColor="text1"/>
-          <w:sz w:val="22"/>
-          <w:szCs w:val="22"/>
-          <w:lang w:eastAsia="zh-CN"/>
+          <w:rFonts w:ascii="Tahoma" w:hAnsi="Tahoma" w:cs="Tahoma"/>
+          <w:noProof/>
+          <w:color w:val="000000" w:themeColor="text1"/>
+          <w:sz w:val="22"/>
+          <w:szCs w:val="22"/>
+          <w:lang w:eastAsia="Tahoma"/>
         </w:rPr>
         <w:t>as needed.</w:t>
       </w:r>
@@ -740,12 +740,12 @@
       <w:pPr>
         <w:pStyle w:val="ListParagraph"/>
         <w:rPr>
-          <w:rFonts w:ascii="Arial" w:hAnsi="Arial" w:cs="Arial"/>
-          <w:noProof/>
-          <w:color w:val="000000" w:themeColor="text1"/>
-          <w:sz w:val="22"/>
-          <w:szCs w:val="22"/>
-          <w:lang w:eastAsia="zh-CN"/>
+          <w:rFonts w:ascii="Tahoma" w:hAnsi="Tahoma" w:cs="Tahoma"/>
+          <w:noProof/>
+          <w:color w:val="000000" w:themeColor="text1"/>
+          <w:sz w:val="22"/>
+          <w:szCs w:val="22"/>
+          <w:lang w:eastAsia="Tahoma"/>
         </w:rPr>
       </w:pPr>
     </w:p>
@@ -753,40 +753,40 @@
       <w:pPr>
         <w:pStyle w:val="ListParagraph"/>
         <w:rPr>
-          <w:rFonts w:ascii="Arial" w:hAnsi="Arial" w:cs="Arial"/>
-          <w:noProof/>
-          <w:color w:val="000000" w:themeColor="text1"/>
-          <w:sz w:val="22"/>
-          <w:szCs w:val="22"/>
-          <w:lang w:eastAsia="zh-CN"/>
+          <w:rFonts w:ascii="Tahoma" w:hAnsi="Tahoma" w:cs="Tahoma"/>
+          <w:noProof/>
+          <w:color w:val="000000" w:themeColor="text1"/>
+          <w:sz w:val="22"/>
+          <w:szCs w:val="22"/>
+          <w:lang w:eastAsia="Tahoma"/>
         </w:rPr>
       </w:pPr>
     </w:p>
     <w:p>
       <w:pPr>
         <w:rPr>
-          <w:rFonts w:ascii="Arial" w:hAnsi="Arial" w:cs="Arial"/>
-          <w:noProof/>
-          <w:color w:val="000000" w:themeColor="text1"/>
-          <w:sz w:val="22"/>
-          <w:szCs w:val="22"/>
-          <w:lang w:eastAsia="zh-CN"/>
-        </w:rPr>
-      </w:pPr>
-      <w:r>
-        <w:rPr>
-          <w:rFonts w:ascii="Arial" w:hAnsi="Arial" w:cs="Arial"/>
-          <w:noProof/>
-          <w:color w:val="000000" w:themeColor="text1"/>
-          <w:sz w:val="22"/>
-          <w:szCs w:val="22"/>
-          <w:lang w:eastAsia="zh-CN"/>
+          <w:rFonts w:ascii="Tahoma" w:hAnsi="Tahoma" w:cs="Tahoma"/>
+          <w:noProof/>
+          <w:color w:val="000000" w:themeColor="text1"/>
+          <w:sz w:val="22"/>
+          <w:szCs w:val="22"/>
+          <w:lang w:eastAsia="Tahoma"/>
+        </w:rPr>
+      </w:pPr>
+      <w:r>
+        <w:rPr>
+          <w:rFonts w:ascii="Tahoma" w:hAnsi="Tahoma" w:cs="Tahoma"/>
+          <w:noProof/>
+          <w:color w:val="000000" w:themeColor="text1"/>
+          <w:sz w:val="22"/>
+          <w:szCs w:val="22"/>
+          <w:lang w:eastAsia="Tahoma"/>
         </w:rPr>
         <w:t xml:space="preserve">This policy demonstrates our strong commitment to </w:t>
       </w:r>
       <w:r>
         <w:rPr>
-          <w:rFonts w:ascii="Arial" w:hAnsi="Arial" w:cs="Arial"/>
+          <w:rFonts w:ascii="Tahoma" w:hAnsi="Tahoma" w:cs="Tahoma"/>
           <w:sz w:val="22"/>
           <w:szCs w:val="22"/>
         </w:rPr>
@@ -794,34 +794,34 @@
       </w:r>
       <w:r>
         <w:rPr>
-          <w:rFonts w:ascii="Arial" w:hAnsi="Arial" w:cs="Arial"/>
-          <w:noProof/>
-          <w:color w:val="000000" w:themeColor="text1"/>
-          <w:sz w:val="22"/>
-          <w:szCs w:val="22"/>
-          <w:lang w:eastAsia="zh-CN"/>
+          <w:rFonts w:ascii="Tahoma" w:hAnsi="Tahoma" w:cs="Tahoma"/>
+          <w:noProof/>
+          <w:color w:val="000000" w:themeColor="text1"/>
+          <w:sz w:val="22"/>
+          <w:szCs w:val="22"/>
+          <w:lang w:eastAsia="Tahoma"/>
         </w:rPr>
         <w:t xml:space="preserve">al </w:t>
       </w:r>
       <w:r>
         <w:rPr>
-          <w:rFonts w:ascii="Arial" w:hAnsi="Arial" w:cs="Arial"/>
-          <w:noProof/>
-          <w:color w:val="000000" w:themeColor="text1"/>
-          <w:sz w:val="22"/>
-          <w:szCs w:val="22"/>
-          <w:lang w:eastAsia="zh-CN"/>
+          <w:rFonts w:ascii="Tahoma" w:hAnsi="Tahoma" w:cs="Tahoma"/>
+          <w:noProof/>
+          <w:color w:val="000000" w:themeColor="text1"/>
+          <w:sz w:val="22"/>
+          <w:szCs w:val="22"/>
+          <w:lang w:eastAsia="Tahoma"/>
         </w:rPr>
         <w:t>management systems</w:t>
       </w:r>
       <w:r>
         <w:rPr>
-          <w:rFonts w:ascii="Arial" w:hAnsi="Arial" w:cs="Arial"/>
-          <w:noProof/>
-          <w:color w:val="000000" w:themeColor="text1"/>
-          <w:sz w:val="22"/>
-          <w:szCs w:val="22"/>
-          <w:lang w:eastAsia="zh-CN"/>
+          <w:rFonts w:ascii="Tahoma" w:hAnsi="Tahoma" w:cs="Tahoma"/>
+          <w:noProof/>
+          <w:color w:val="000000" w:themeColor="text1"/>
+          <w:sz w:val="22"/>
+          <w:szCs w:val="22"/>
+          <w:lang w:eastAsia="Tahoma"/>
         </w:rPr>
         <w:t>. It will be regularly reviewed and updated to stay effective and relevant. The policy will be communicated to all employees, contractors, and stakeholders to ensure a unified commitment to achieving our objectives.</w:t>
       </w:r>
@@ -829,273 +829,273 @@
     <w:p>
       <w:pPr>
         <w:rPr>
-          <w:rFonts w:ascii="Arial" w:hAnsi="Arial" w:cs="Arial"/>
-          <w:noProof/>
-          <w:color w:val="000000" w:themeColor="text1"/>
-          <w:sz w:val="22"/>
-          <w:szCs w:val="22"/>
-          <w:lang w:eastAsia="zh-CN"/>
+          <w:rFonts w:ascii="Tahoma" w:hAnsi="Tahoma" w:cs="Tahoma"/>
+          <w:noProof/>
+          <w:color w:val="000000" w:themeColor="text1"/>
+          <w:sz w:val="22"/>
+          <w:szCs w:val="22"/>
+          <w:lang w:eastAsia="Tahoma"/>
         </w:rPr>
       </w:pPr>
     </w:p>
     <w:p>
       <w:pPr>
         <w:rPr>
-          <w:rFonts w:ascii="Arial" w:hAnsi="Arial" w:cs="Arial"/>
+          <w:rFonts w:ascii="Tahoma" w:hAnsi="Tahoma" w:cs="Tahoma"/>
           <w:b/>
           <w:bCs/>
           <w:noProof/>
           <w:color w:val="000000" w:themeColor="text1"/>
           <w:sz w:val="22"/>
           <w:szCs w:val="22"/>
-          <w:lang w:eastAsia="zh-CN"/>
+          <w:lang w:eastAsia="Tahoma"/>
         </w:rPr>
       </w:pPr>
     </w:p>
     <w:p>
       <w:pPr>
         <w:rPr>
-          <w:rFonts w:ascii="Arial" w:hAnsi="Arial" w:cs="Arial"/>
+          <w:rFonts w:ascii="Tahoma" w:hAnsi="Tahoma" w:cs="Tahoma"/>
           <w:b/>
           <w:bCs/>
           <w:noProof/>
           <w:color w:val="000000" w:themeColor="text1"/>
           <w:sz w:val="22"/>
           <w:szCs w:val="22"/>
-          <w:lang w:eastAsia="zh-CN"/>
+          <w:lang w:eastAsia="Tahoma"/>
         </w:rPr>
       </w:pPr>
     </w:p>
     <w:p>
       <w:pPr>
         <w:rPr>
-          <w:rFonts w:ascii="Arial" w:hAnsi="Arial" w:cs="Arial"/>
+          <w:rFonts w:ascii="Tahoma" w:hAnsi="Tahoma" w:cs="Tahoma"/>
           <w:b/>
           <w:bCs/>
           <w:noProof/>
           <w:color w:val="000000" w:themeColor="text1"/>
           <w:sz w:val="22"/>
           <w:szCs w:val="22"/>
-          <w:lang w:eastAsia="zh-CN"/>
+          <w:lang w:eastAsia="Tahoma"/>
         </w:rPr>
       </w:pPr>
     </w:p>
     <w:p>
       <w:pPr>
         <w:rPr>
-          <w:rFonts w:ascii="Arial" w:hAnsi="Arial" w:cs="Arial"/>
+          <w:rFonts w:ascii="Tahoma" w:hAnsi="Tahoma" w:cs="Tahoma"/>
           <w:b/>
           <w:bCs/>
           <w:noProof/>
           <w:color w:val="000000" w:themeColor="text1"/>
           <w:sz w:val="22"/>
           <w:szCs w:val="22"/>
-          <w:lang w:eastAsia="zh-CN"/>
+          <w:lang w:eastAsia="Tahoma"/>
         </w:rPr>
       </w:pPr>
     </w:p>
     <w:p>
       <w:pPr>
         <w:rPr>
-          <w:rFonts w:ascii="Arial" w:hAnsi="Arial" w:cs="Arial"/>
+          <w:rFonts w:ascii="Tahoma" w:hAnsi="Tahoma" w:cs="Tahoma"/>
           <w:b/>
           <w:bCs/>
           <w:noProof/>
           <w:color w:val="000000" w:themeColor="text1"/>
           <w:sz w:val="22"/>
           <w:szCs w:val="22"/>
-          <w:lang w:eastAsia="zh-CN"/>
+          <w:lang w:eastAsia="Tahoma"/>
         </w:rPr>
       </w:pPr>
     </w:p>
     <w:p>
       <w:pPr>
         <w:rPr>
-          <w:rFonts w:ascii="Arial" w:hAnsi="Arial" w:cs="Arial"/>
+          <w:rFonts w:ascii="Tahoma" w:hAnsi="Tahoma" w:cs="Tahoma"/>
           <w:b/>
           <w:bCs/>
           <w:noProof/>
           <w:color w:val="000000" w:themeColor="text1"/>
           <w:sz w:val="22"/>
           <w:szCs w:val="22"/>
-          <w:lang w:eastAsia="zh-CN"/>
+          <w:lang w:eastAsia="Tahoma"/>
         </w:rPr>
       </w:pPr>
     </w:p>
     <w:p>
       <w:pPr>
         <w:rPr>
-          <w:rFonts w:ascii="Arial" w:hAnsi="Arial" w:cs="Arial"/>
+          <w:rFonts w:ascii="Tahoma" w:hAnsi="Tahoma" w:cs="Tahoma"/>
           <w:b/>
           <w:bCs/>
           <w:noProof/>
           <w:color w:val="000000" w:themeColor="text1"/>
           <w:sz w:val="22"/>
           <w:szCs w:val="22"/>
-          <w:lang w:eastAsia="zh-CN"/>
+          <w:lang w:eastAsia="Tahoma"/>
         </w:rPr>
       </w:pPr>
     </w:p>
     <w:p>
       <w:pPr>
         <w:rPr>
-          <w:rFonts w:ascii="Arial" w:hAnsi="Arial" w:cs="Arial"/>
-          <w:color w:val="000000" w:themeColor="text1"/>
-          <w:sz w:val="22"/>
-          <w:szCs w:val="22"/>
-        </w:rPr>
-      </w:pPr>
-      <w:r>
-        <w:rPr>
-          <w:rFonts w:ascii="Arial" w:hAnsi="Arial" w:cs="Arial"/>
-          <w:noProof/>
-          <w:color w:val="000000" w:themeColor="text1"/>
-          <w:sz w:val="22"/>
-          <w:szCs w:val="22"/>
-          <w:lang w:eastAsia="zh-CN"/>
+          <w:rFonts w:ascii="Tahoma" w:hAnsi="Tahoma" w:cs="Tahoma"/>
+          <w:color w:val="000000" w:themeColor="text1"/>
+          <w:sz w:val="22"/>
+          <w:szCs w:val="22"/>
+        </w:rPr>
+      </w:pPr>
+      <w:r>
+        <w:rPr>
+          <w:rFonts w:ascii="Tahoma" w:hAnsi="Tahoma" w:cs="Tahoma"/>
+          <w:noProof/>
+          <w:color w:val="000000" w:themeColor="text1"/>
+          <w:sz w:val="22"/>
+          <w:szCs w:val="22"/>
+          <w:lang w:eastAsia="Tahoma"/>
         </w:rPr>
         <w:t xml:space="preserve">   </w:t>
       </w:r>
       <w:r>
         <w:rPr>
-          <w:rFonts w:ascii="Arial" w:hAnsi="Arial" w:cs="Arial"/>
-          <w:noProof/>
-          <w:color w:val="000000" w:themeColor="text1"/>
-          <w:sz w:val="22"/>
-          <w:szCs w:val="22"/>
-          <w:lang w:eastAsia="zh-CN"/>
+          <w:rFonts w:ascii="Tahoma" w:hAnsi="Tahoma" w:cs="Tahoma"/>
+          <w:noProof/>
+          <w:color w:val="000000" w:themeColor="text1"/>
+          <w:sz w:val="22"/>
+          <w:szCs w:val="22"/>
+          <w:lang w:eastAsia="Tahoma"/>
         </w:rPr>
         <w:t xml:space="preserve">             </w:t>
       </w:r>
       <w:r>
         <w:rPr>
-          <w:rFonts w:ascii="Arial" w:hAnsi="Arial" w:cs="Arial"/>
-          <w:noProof/>
-          <w:color w:val="000000" w:themeColor="text1"/>
-          <w:sz w:val="22"/>
-          <w:szCs w:val="22"/>
-          <w:lang w:eastAsia="zh-CN"/>
+          <w:rFonts w:ascii="Tahoma" w:hAnsi="Tahoma" w:cs="Tahoma"/>
+          <w:noProof/>
+          <w:color w:val="000000" w:themeColor="text1"/>
+          <w:sz w:val="22"/>
+          <w:szCs w:val="22"/>
+          <w:lang w:eastAsia="Tahoma"/>
         </w:rPr>
         <w:t>C</w:t>
       </w:r>
       <w:r>
         <w:rPr>
-          <w:rFonts w:ascii="Arial" w:hAnsi="Arial" w:cs="Arial"/>
-          <w:noProof/>
-          <w:color w:val="000000" w:themeColor="text1"/>
-          <w:sz w:val="22"/>
-          <w:szCs w:val="22"/>
-          <w:lang w:eastAsia="zh-CN"/>
+          <w:rFonts w:ascii="Tahoma" w:hAnsi="Tahoma" w:cs="Tahoma"/>
+          <w:noProof/>
+          <w:color w:val="000000" w:themeColor="text1"/>
+          <w:sz w:val="22"/>
+          <w:szCs w:val="22"/>
+          <w:lang w:eastAsia="Tahoma"/>
         </w:rPr>
         <w:t>E</w:t>
       </w:r>
       <w:r>
         <w:rPr>
-          <w:rFonts w:ascii="Arial" w:hAnsi="Arial" w:cs="Arial"/>
-          <w:noProof/>
-          <w:color w:val="000000" w:themeColor="text1"/>
-          <w:sz w:val="22"/>
-          <w:szCs w:val="22"/>
-          <w:lang w:eastAsia="zh-CN"/>
+          <w:rFonts w:ascii="Tahoma" w:hAnsi="Tahoma" w:cs="Tahoma"/>
+          <w:noProof/>
+          <w:color w:val="000000" w:themeColor="text1"/>
+          <w:sz w:val="22"/>
+          <w:szCs w:val="22"/>
+          <w:lang w:eastAsia="Tahoma"/>
         </w:rPr>
         <w:t>O</w:t>
       </w:r>
       <w:r>
         <w:rPr>
-          <w:rFonts w:ascii="Arial" w:hAnsi="Arial" w:cs="Arial"/>
-          <w:noProof/>
-          <w:color w:val="000000" w:themeColor="text1"/>
-          <w:sz w:val="22"/>
-          <w:szCs w:val="22"/>
-          <w:lang w:eastAsia="zh-CN"/>
+          <w:rFonts w:ascii="Tahoma" w:hAnsi="Tahoma" w:cs="Tahoma"/>
+          <w:noProof/>
+          <w:color w:val="000000" w:themeColor="text1"/>
+          <w:sz w:val="22"/>
+          <w:szCs w:val="22"/>
+          <w:lang w:eastAsia="Tahoma"/>
         </w:rPr>
         <w:tab/>
       </w:r>
       <w:r>
         <w:rPr>
-          <w:rFonts w:ascii="Arial" w:hAnsi="Arial" w:cs="Arial"/>
-          <w:noProof/>
-          <w:color w:val="000000" w:themeColor="text1"/>
-          <w:sz w:val="22"/>
-          <w:szCs w:val="22"/>
-          <w:lang w:eastAsia="zh-CN"/>
+          <w:rFonts w:ascii="Tahoma" w:hAnsi="Tahoma" w:cs="Tahoma"/>
+          <w:noProof/>
+          <w:color w:val="000000" w:themeColor="text1"/>
+          <w:sz w:val="22"/>
+          <w:szCs w:val="22"/>
+          <w:lang w:eastAsia="Tahoma"/>
         </w:rPr>
         <w:tab/>
       </w:r>
       <w:r>
         <w:rPr>
-          <w:rFonts w:ascii="Arial" w:hAnsi="Arial" w:cs="Arial"/>
-          <w:noProof/>
-          <w:color w:val="000000" w:themeColor="text1"/>
-          <w:sz w:val="22"/>
-          <w:szCs w:val="22"/>
-          <w:lang w:eastAsia="zh-CN"/>
+          <w:rFonts w:ascii="Tahoma" w:hAnsi="Tahoma" w:cs="Tahoma"/>
+          <w:noProof/>
+          <w:color w:val="000000" w:themeColor="text1"/>
+          <w:sz w:val="22"/>
+          <w:szCs w:val="22"/>
+          <w:lang w:eastAsia="Tahoma"/>
         </w:rPr>
         <w:tab/>
       </w:r>
       <w:r>
         <w:rPr>
-          <w:rFonts w:ascii="Arial" w:hAnsi="Arial" w:cs="Arial"/>
-          <w:noProof/>
-          <w:color w:val="000000" w:themeColor="text1"/>
-          <w:sz w:val="22"/>
-          <w:szCs w:val="22"/>
-          <w:lang w:eastAsia="zh-CN"/>
+          <w:rFonts w:ascii="Tahoma" w:hAnsi="Tahoma" w:cs="Tahoma"/>
+          <w:noProof/>
+          <w:color w:val="000000" w:themeColor="text1"/>
+          <w:sz w:val="22"/>
+          <w:szCs w:val="22"/>
+          <w:lang w:eastAsia="Tahoma"/>
         </w:rPr>
         <w:tab/>
       </w:r>
       <w:r>
         <w:rPr>
-          <w:rFonts w:ascii="Arial" w:hAnsi="Arial" w:cs="Arial"/>
-          <w:noProof/>
-          <w:color w:val="000000" w:themeColor="text1"/>
-          <w:sz w:val="22"/>
-          <w:szCs w:val="22"/>
-          <w:lang w:eastAsia="zh-CN"/>
+          <w:rFonts w:ascii="Tahoma" w:hAnsi="Tahoma" w:cs="Tahoma"/>
+          <w:noProof/>
+          <w:color w:val="000000" w:themeColor="text1"/>
+          <w:sz w:val="22"/>
+          <w:szCs w:val="22"/>
+          <w:lang w:eastAsia="Tahoma"/>
         </w:rPr>
         <w:tab/>
       </w:r>
       <w:r>
         <w:rPr>
-          <w:rFonts w:ascii="Arial" w:hAnsi="Arial" w:cs="Arial"/>
-          <w:noProof/>
-          <w:color w:val="000000" w:themeColor="text1"/>
-          <w:sz w:val="22"/>
-          <w:szCs w:val="22"/>
-          <w:lang w:eastAsia="zh-CN"/>
+          <w:rFonts w:ascii="Tahoma" w:hAnsi="Tahoma" w:cs="Tahoma"/>
+          <w:noProof/>
+          <w:color w:val="000000" w:themeColor="text1"/>
+          <w:sz w:val="22"/>
+          <w:szCs w:val="22"/>
+          <w:lang w:eastAsia="Tahoma"/>
         </w:rPr>
         <w:tab/>
       </w:r>
       <w:r>
         <w:rPr>
-          <w:rFonts w:ascii="Arial" w:hAnsi="Arial" w:cs="Arial"/>
-          <w:noProof/>
-          <w:color w:val="000000" w:themeColor="text1"/>
-          <w:sz w:val="22"/>
-          <w:szCs w:val="22"/>
-          <w:lang w:eastAsia="zh-CN"/>
+          <w:rFonts w:ascii="Tahoma" w:hAnsi="Tahoma" w:cs="Tahoma"/>
+          <w:noProof/>
+          <w:color w:val="000000" w:themeColor="text1"/>
+          <w:sz w:val="22"/>
+          <w:szCs w:val="22"/>
+          <w:lang w:eastAsia="Tahoma"/>
         </w:rPr>
         <w:tab/>
       </w:r>
       <w:r>
         <w:rPr>
-          <w:rFonts w:ascii="Arial" w:hAnsi="Arial" w:cs="Arial"/>
-          <w:noProof/>
-          <w:color w:val="000000" w:themeColor="text1"/>
-          <w:sz w:val="22"/>
-          <w:szCs w:val="22"/>
-          <w:lang w:eastAsia="zh-CN"/>
+          <w:rFonts w:ascii="Tahoma" w:hAnsi="Tahoma" w:cs="Tahoma"/>
+          <w:noProof/>
+          <w:color w:val="000000" w:themeColor="text1"/>
+          <w:sz w:val="22"/>
+          <w:szCs w:val="22"/>
+          <w:lang w:eastAsia="Tahoma"/>
         </w:rPr>
         <w:tab/>
       </w:r>
       <w:r>
         <w:rPr>
-          <w:rFonts w:ascii="Arial" w:hAnsi="Arial" w:cs="Arial"/>
-          <w:noProof/>
-          <w:color w:val="000000" w:themeColor="text1"/>
-          <w:sz w:val="22"/>
-          <w:szCs w:val="22"/>
-          <w:lang w:eastAsia="zh-CN"/>
+          <w:rFonts w:ascii="Tahoma" w:hAnsi="Tahoma" w:cs="Tahoma"/>
+          <w:noProof/>
+          <w:color w:val="000000" w:themeColor="text1"/>
+          <w:sz w:val="22"/>
+          <w:szCs w:val="22"/>
+          <w:lang w:eastAsia="Tahoma"/>
         </w:rPr>
         <w:t xml:space="preserve">                                </w:t>
       </w:r>
@@ -1103,7 +1103,7 @@
     <w:p>
       <w:pPr>
         <w:rPr>
-          <w:rFonts w:ascii="Helvetica-Normal" w:hAnsi="Helvetica-Normal" w:cs="GE SS Two Medium"/>
+          <w:rFonts w:ascii="Tahoma" w:hAnsi="Tahoma" w:cs="Tahoma"/>
           <w:sz w:val="22"/>
           <w:szCs w:val="22"/>
         </w:rPr>
@@ -1112,14 +1112,14 @@
     <w:p>
       <w:pPr>
         <w:rPr>
-          <w:rFonts w:ascii="Helvetica-Normal" w:hAnsi="Helvetica-Normal" w:cs="GE SS Two Medium"/>
-          <w:sz w:val="22"/>
-          <w:szCs w:val="22"/>
-        </w:rPr>
-      </w:pPr>
-      <w:r>
-        <w:rPr>
-          <w:rFonts w:ascii="Helvetica-Normal" w:hAnsi="Helvetica-Normal" w:cs="GE SS Two Medium"/>
+          <w:rFonts w:ascii="Tahoma" w:hAnsi="Tahoma" w:cs="Tahoma"/>
+          <w:sz w:val="22"/>
+          <w:szCs w:val="22"/>
+        </w:rPr>
+      </w:pPr>
+      <w:r>
+        <w:rPr>
+          <w:rFonts w:ascii="Tahoma" w:hAnsi="Tahoma" w:cs="Tahoma"/>
           <w:sz w:val="22"/>
           <w:szCs w:val="22"/>
         </w:rPr>
@@ -1209,14 +1209,14 @@
         <w:p>
           <w:pPr>
             <w:rPr>
-              <w:rFonts w:ascii="Arial" w:hAnsi="Arial" w:cs="Arial"/>
+              <w:rFonts w:ascii="Tahoma" w:hAnsi="Tahoma" w:cs="Tahoma"/>
               <w:sz w:val="22"/>
               <w:szCs w:val="22"/>
             </w:rPr>
           </w:pPr>
           <w:r>
             <w:rPr>
-              <w:rFonts w:ascii="Arial" w:hAnsi="Arial" w:cs="Arial"/>
+              <w:rFonts w:ascii="Tahoma" w:hAnsi="Tahoma" w:cs="Tahoma"/>
               <w:noProof/>
               <w:sz w:val="22"/>
               <w:szCs w:val="22"/>
@@ -1293,7 +1293,7 @@
           </w:r>
           <w:r>
             <w:rPr>
-              <w:rFonts w:ascii="Arial" w:hAnsi="Arial" w:cs="Arial"/>
+              <w:rFonts w:ascii="Tahoma" w:hAnsi="Tahoma" w:cs="Tahoma"/>
               <w:noProof/>
               <w:sz w:val="22"/>
               <w:szCs w:val="22"/>
@@ -1367,7 +1367,7 @@
           </w:r>
           <w:r>
             <w:rPr>
-              <w:rFonts w:ascii="Arial" w:hAnsi="Arial" w:cs="Arial"/>
+              <w:rFonts w:ascii="Tahoma" w:hAnsi="Tahoma" w:cs="Tahoma"/>
               <w:b/>
               <w:bCs/>
               <w:sz w:val="22"/>
@@ -1380,7 +1380,7 @@
           <w:pPr>
             <w:ind w:firstLine="720"/>
             <w:rPr>
-              <w:rFonts w:ascii="Arial" w:hAnsi="Arial" w:cs="Arial"/>
+              <w:rFonts w:ascii="Tahoma" w:hAnsi="Tahoma" w:cs="Tahoma"/>
               <w:sz w:val="22"/>
               <w:szCs w:val="22"/>
             </w:rPr>
@@ -1397,7 +1397,7 @@
           <w:pPr>
             <w:jc w:val="center"/>
             <w:rPr>
-              <w:rFonts w:ascii="Arial" w:hAnsi="Arial" w:cs="Arial"/>
+              <w:rFonts w:ascii="Tahoma" w:hAnsi="Tahoma" w:cs="Tahoma"/>
               <w:b/>
               <w:bCs/>
               <w:sz w:val="22"/>
@@ -1406,7 +1406,7 @@
           </w:pPr>
           <w:r>
             <w:rPr>
-              <w:rFonts w:ascii="Arial" w:hAnsi="Arial" w:cs="Arial"/>
+              <w:rFonts w:ascii="Tahoma" w:hAnsi="Tahoma" w:cs="Tahoma"/>
               <w:b/>
               <w:bCs/>
               <w:sz w:val="22"/>
@@ -1430,14 +1430,14 @@
         <w:p>
           <w:pPr>
             <w:rPr>
-              <w:rFonts w:ascii="Arial" w:hAnsi="Arial" w:cs="Arial"/>
+              <w:rFonts w:ascii="Tahoma" w:hAnsi="Tahoma" w:cs="Tahoma"/>
               <w:sz w:val="22"/>
               <w:szCs w:val="22"/>
             </w:rPr>
           </w:pPr>
           <w:r>
             <w:rPr>
-              <w:rFonts w:ascii="Arial" w:hAnsi="Arial" w:cs="Arial"/>
+              <w:rFonts w:ascii="Tahoma" w:hAnsi="Tahoma" w:cs="Tahoma"/>
               <w:b/>
               <w:bCs/>
               <w:sz w:val="22"/>
@@ -1447,7 +1447,7 @@
           </w:r>
           <w:r>
             <w:rPr>
-              <w:rFonts w:ascii="Arial" w:hAnsi="Arial" w:cs="Arial"/>
+              <w:rFonts w:ascii="Tahoma" w:hAnsi="Tahoma" w:cs="Tahoma"/>
               <w:b/>
               <w:bCs/>
               <w:sz w:val="22"/>
@@ -1457,7 +1457,7 @@
           </w:r>
           <w:r>
             <w:rPr>
-              <w:rFonts w:ascii="Arial" w:hAnsi="Arial" w:cs="Arial"/>
+              <w:rFonts w:ascii="Tahoma" w:hAnsi="Tahoma" w:cs="Tahoma"/>
               <w:b/>
               <w:bCs/>
               <w:sz w:val="22"/>
@@ -1475,14 +1475,14 @@
         <w:p>
           <w:pPr>
             <w:rPr>
-              <w:rFonts w:ascii="Arial" w:hAnsi="Arial" w:cs="Arial"/>
+              <w:rFonts w:ascii="Tahoma" w:hAnsi="Tahoma" w:cs="Tahoma"/>
               <w:sz w:val="22"/>
               <w:szCs w:val="22"/>
             </w:rPr>
           </w:pPr>
           <w:r>
             <w:rPr>
-              <w:rFonts w:ascii="Arial" w:hAnsi="Arial" w:cs="Arial"/>
+              <w:rFonts w:ascii="Tahoma" w:hAnsi="Tahoma" w:cs="Tahoma"/>
               <w:b/>
               <w:bCs/>
               <w:sz w:val="22"/>
@@ -1492,7 +1492,7 @@
           </w:r>
           <w:r>
             <w:rPr>
-              <w:rFonts w:ascii="Arial" w:hAnsi="Arial" w:cs="Arial"/>
+              <w:rFonts w:ascii="Tahoma" w:hAnsi="Tahoma" w:cs="Tahoma"/>
               <w:sz w:val="22"/>
               <w:szCs w:val="22"/>
             </w:rPr>
@@ -1500,7 +1500,7 @@
           </w:r>
           <w:r>
             <w:rPr>
-              <w:rFonts w:ascii="Arial" w:hAnsi="Arial" w:cs="Arial"/>
+              <w:rFonts w:ascii="Tahoma" w:hAnsi="Tahoma" w:cs="Tahoma"/>
               <w:b/>
               <w:bCs/>
               <w:sz w:val="22"/>
@@ -1524,17 +1524,17 @@
               <w:right w:val="single" w:sz="6" w:space="0" w:color="FFFFFF"/>
             </w:pBdr>
             <w:rPr>
-              <w:rFonts w:ascii="Arial" w:hAnsi="Arial" w:cs="Arial"/>
+              <w:rFonts w:ascii="Tahoma" w:hAnsi="Tahoma" w:cs="Tahoma"/>
               <w:b/>
               <w:bCs/>
               <w:sz w:val="22"/>
               <w:szCs w:val="22"/>
-              <w:lang w:eastAsia="zh-CN"/>
+              <w:lang w:eastAsia="Tahoma"/>
             </w:rPr>
           </w:pPr>
           <w:r>
             <w:rPr>
-              <w:rFonts w:ascii="Arial" w:hAnsi="Arial" w:cs="Arial"/>
+              <w:rFonts w:ascii="Tahoma" w:hAnsi="Tahoma" w:cs="Tahoma"/>
               <w:b/>
               <w:bCs/>
               <w:sz w:val="22"/>
@@ -1544,7 +1544,7 @@
           </w:r>
           <w:r>
             <w:rPr>
-              <w:rFonts w:ascii="Arial" w:hAnsi="Arial" w:cs="Arial"/>
+              <w:rFonts w:ascii="Tahoma" w:hAnsi="Tahoma" w:cs="Tahoma"/>
               <w:b/>
               <w:bCs/>
               <w:sz w:val="22"/>
@@ -1554,7 +1554,7 @@
           </w:r>
           <w:r>
             <w:rPr>
-              <w:rFonts w:ascii="Arial" w:hAnsi="Arial" w:cs="Arial"/>
+              <w:rFonts w:ascii="Tahoma" w:hAnsi="Tahoma" w:cs="Tahoma"/>
               <w:b/>
               <w:bCs/>
               <w:sz w:val="22"/>
@@ -1564,7 +1564,7 @@
           </w:r>
           <w:r>
             <w:rPr>
-              <w:rFonts w:ascii="Arial" w:hAnsi="Arial" w:cs="Arial"/>
+              <w:rFonts w:ascii="Tahoma" w:hAnsi="Tahoma" w:cs="Tahoma"/>
               <w:b/>
               <w:bCs/>
               <w:sz w:val="22"/>
@@ -1574,7 +1574,7 @@
           </w:r>
           <w:r>
             <w:rPr>
-              <w:rFonts w:ascii="Arial" w:hAnsi="Arial" w:cs="Arial"/>
+              <w:rFonts w:ascii="Tahoma" w:hAnsi="Tahoma" w:cs="Tahoma"/>
               <w:b/>
               <w:bCs/>
               <w:noProof/>
@@ -1585,7 +1585,7 @@
           </w:r>
           <w:r>
             <w:rPr>
-              <w:rFonts w:ascii="Arial" w:hAnsi="Arial" w:cs="Arial"/>
+              <w:rFonts w:ascii="Tahoma" w:hAnsi="Tahoma" w:cs="Tahoma"/>
               <w:b/>
               <w:bCs/>
               <w:sz w:val="22"/>
@@ -1595,7 +1595,7 @@
           </w:r>
           <w:r>
             <w:rPr>
-              <w:rFonts w:ascii="Arial" w:hAnsi="Arial" w:cs="Arial"/>
+              <w:rFonts w:ascii="Tahoma" w:hAnsi="Tahoma" w:cs="Tahoma"/>
               <w:b/>
               <w:bCs/>
               <w:sz w:val="22"/>
@@ -1607,14 +1607,14 @@
         <w:p>
           <w:pPr>
             <w:rPr>
-              <w:rFonts w:ascii="Arial" w:hAnsi="Arial" w:cs="Arial"/>
+              <w:rFonts w:ascii="Tahoma" w:hAnsi="Tahoma" w:cs="Tahoma"/>
               <w:sz w:val="22"/>
               <w:szCs w:val="22"/>
             </w:rPr>
           </w:pPr>
           <w:r>
             <w:rPr>
-              <w:rFonts w:ascii="Arial" w:hAnsi="Arial" w:cs="Arial"/>
+              <w:rFonts w:ascii="Tahoma" w:hAnsi="Tahoma" w:cs="Tahoma"/>
               <w:sz w:val="22"/>
               <w:szCs w:val="22"/>
             </w:rPr>
@@ -1622,7 +1622,7 @@
           </w:r>
           <w:r>
             <w:rPr>
-              <w:rFonts w:ascii="Arial" w:hAnsi="Arial" w:cs="Arial"/>
+              <w:rFonts w:ascii="Tahoma" w:hAnsi="Tahoma" w:cs="Tahoma"/>
               <w:sz w:val="22"/>
               <w:szCs w:val="22"/>
             </w:rPr>
@@ -1630,7 +1630,7 @@
           </w:r>
           <w:r>
             <w:rPr>
-              <w:rFonts w:ascii="Arial" w:hAnsi="Arial" w:cs="Arial"/>
+              <w:rFonts w:ascii="Tahoma" w:hAnsi="Tahoma" w:cs="Tahoma"/>
               <w:sz w:val="22"/>
               <w:szCs w:val="22"/>
             </w:rPr>
@@ -1638,7 +1638,7 @@
           </w:r>
           <w:r>
             <w:rPr>
-              <w:rFonts w:ascii="Arial" w:hAnsi="Arial" w:cs="Arial"/>
+              <w:rFonts w:ascii="Tahoma" w:hAnsi="Tahoma" w:cs="Tahoma"/>
               <w:b/>
               <w:bCs/>
               <w:noProof/>
@@ -1649,7 +1649,7 @@
           </w:r>
           <w:r>
             <w:rPr>
-              <w:rFonts w:ascii="Arial" w:hAnsi="Arial" w:cs="Arial"/>
+              <w:rFonts w:ascii="Tahoma" w:hAnsi="Tahoma" w:cs="Tahoma"/>
               <w:b/>
               <w:bCs/>
               <w:noProof/>
@@ -1674,14 +1674,14 @@
         <w:p>
           <w:pPr>
             <w:rPr>
-              <w:rFonts w:ascii="Arial" w:hAnsi="Arial" w:cs="Arial"/>
+              <w:rFonts w:ascii="Tahoma" w:hAnsi="Tahoma" w:cs="Tahoma"/>
               <w:sz w:val="22"/>
               <w:szCs w:val="22"/>
             </w:rPr>
           </w:pPr>
           <w:r>
             <w:rPr>
-              <w:rFonts w:ascii="Arial" w:hAnsi="Arial" w:cs="Arial"/>
+              <w:rFonts w:ascii="Tahoma" w:hAnsi="Tahoma" w:cs="Tahoma"/>
               <w:b/>
               <w:bCs/>
               <w:sz w:val="22"/>
@@ -1699,14 +1699,14 @@
         <w:p>
           <w:pPr>
             <w:rPr>
-              <w:rFonts w:ascii="Arial" w:hAnsi="Arial" w:cs="Arial"/>
+              <w:rFonts w:ascii="Tahoma" w:hAnsi="Tahoma" w:cs="Tahoma"/>
               <w:sz w:val="22"/>
               <w:szCs w:val="22"/>
             </w:rPr>
           </w:pPr>
           <w:r>
             <w:rPr>
-              <w:rFonts w:ascii="Arial" w:hAnsi="Arial" w:cs="Arial"/>
+              <w:rFonts w:ascii="Tahoma" w:hAnsi="Tahoma" w:cs="Tahoma"/>
               <w:b/>
               <w:bCs/>
               <w:sz w:val="22"/>
@@ -1724,14 +1724,14 @@
         <w:p>
           <w:pPr>
             <w:rPr>
-              <w:rFonts w:ascii="Arial" w:hAnsi="Arial" w:cs="Arial"/>
+              <w:rFonts w:ascii="Tahoma" w:hAnsi="Tahoma" w:cs="Tahoma"/>
               <w:sz w:val="22"/>
               <w:szCs w:val="22"/>
             </w:rPr>
           </w:pPr>
           <w:r>
             <w:rPr>
-              <w:rFonts w:ascii="Arial" w:eastAsia="Calibri" w:hAnsi="Arial" w:cs="Arial"/>
+              <w:rFonts w:ascii="Tahoma" w:eastAsia="Tahoma" w:hAnsi="Tahoma" w:cs="Tahoma"/>
               <w:b/>
               <w:bCs/>
               <w:sz w:val="22"/>
@@ -1741,7 +1741,7 @@
           </w:r>
           <w:r>
             <w:rPr>
-              <w:rFonts w:ascii="Arial" w:hAnsi="Arial" w:cs="Arial"/>
+              <w:rFonts w:ascii="Tahoma" w:hAnsi="Tahoma" w:cs="Tahoma"/>
               <w:b/>
               <w:bCs/>
               <w:sz w:val="22"/>
@@ -1765,14 +1765,14 @@
         <w:p>
           <w:pPr>
             <w:rPr>
-              <w:rFonts w:ascii="Arial" w:hAnsi="Arial" w:cs="Arial"/>
+              <w:rFonts w:ascii="Tahoma" w:hAnsi="Tahoma" w:cs="Tahoma"/>
               <w:sz w:val="22"/>
               <w:szCs w:val="22"/>
             </w:rPr>
           </w:pPr>
           <w:r>
             <w:rPr>
-              <w:rFonts w:ascii="Arial" w:hAnsi="Arial" w:cs="Arial"/>
+              <w:rFonts w:ascii="Tahoma" w:hAnsi="Tahoma" w:cs="Tahoma"/>
               <w:b/>
               <w:bCs/>
               <w:sz w:val="22"/>
@@ -1782,7 +1782,7 @@
           </w:r>
           <w:r>
             <w:rPr>
-              <w:rFonts w:ascii="Arial" w:hAnsi="Arial" w:cs="Arial"/>
+              <w:rFonts w:ascii="Tahoma" w:hAnsi="Tahoma" w:cs="Tahoma"/>
               <w:b/>
               <w:bCs/>
               <w:sz w:val="22"/>
@@ -1800,14 +1800,14 @@
         <w:p>
           <w:pPr>
             <w:rPr>
-              <w:rFonts w:ascii="Arial" w:hAnsi="Arial" w:cs="Arial"/>
+              <w:rFonts w:ascii="Tahoma" w:hAnsi="Tahoma" w:cs="Tahoma"/>
               <w:sz w:val="22"/>
               <w:szCs w:val="22"/>
             </w:rPr>
           </w:pPr>
           <w:r>
             <w:rPr>
-              <w:rFonts w:ascii="Arial" w:hAnsi="Arial" w:cs="Arial"/>
+              <w:rFonts w:ascii="Tahoma" w:hAnsi="Tahoma" w:cs="Tahoma"/>
               <w:b/>
               <w:bCs/>
               <w:sz w:val="22"/>
@@ -1817,7 +1817,7 @@
           </w:r>
           <w:r>
             <w:rPr>
-              <w:rFonts w:ascii="Arial" w:hAnsi="Arial" w:cs="Arial"/>
+              <w:rFonts w:ascii="Tahoma" w:hAnsi="Tahoma" w:cs="Tahoma"/>
               <w:b/>
               <w:bCs/>
               <w:sz w:val="22"/>
@@ -1835,14 +1835,14 @@
         <w:p>
           <w:pPr>
             <w:rPr>
-              <w:rFonts w:ascii="Arial" w:hAnsi="Arial" w:cs="Arial"/>
+              <w:rFonts w:ascii="Tahoma" w:hAnsi="Tahoma" w:cs="Tahoma"/>
               <w:sz w:val="22"/>
               <w:szCs w:val="22"/>
             </w:rPr>
           </w:pPr>
           <w:r>
             <w:rPr>
-              <w:rFonts w:ascii="Arial" w:hAnsi="Arial" w:cs="Arial"/>
+              <w:rFonts w:ascii="Tahoma" w:hAnsi="Tahoma" w:cs="Tahoma"/>
               <w:b/>
               <w:bCs/>
               <w:sz w:val="22"/>
@@ -1852,7 +1852,7 @@
           </w:r>
           <w:r>
             <w:rPr>
-              <w:rFonts w:ascii="Arial" w:hAnsi="Arial" w:cs="Arial"/>
+              <w:rFonts w:ascii="Tahoma" w:hAnsi="Tahoma" w:cs="Tahoma"/>
               <w:b/>
               <w:bCs/>
               <w:sz w:val="22"/>
@@ -1862,7 +1862,7 @@
           </w:r>
           <w:r>
             <w:rPr>
-              <w:rFonts w:ascii="Arial" w:hAnsi="Arial" w:cs="Arial"/>
+              <w:rFonts w:ascii="Tahoma" w:hAnsi="Tahoma" w:cs="Tahoma"/>
               <w:b/>
               <w:bCs/>
               <w:sz w:val="22"/>
@@ -1872,7 +1872,7 @@
           </w:r>
           <w:r>
             <w:rPr>
-              <w:rFonts w:ascii="Arial" w:hAnsi="Arial" w:cs="Arial"/>
+              <w:rFonts w:ascii="Tahoma" w:hAnsi="Tahoma" w:cs="Tahoma"/>
               <w:b/>
               <w:bCs/>
               <w:sz w:val="22"/>
@@ -1919,7 +1919,7 @@
         <w:ind w:left="1440" w:hanging="360"/>
       </w:pPr>
       <w:rPr>
-        <w:rFonts w:ascii="Courier New" w:hAnsi="Courier New" w:cs="Courier New" w:hint="default"/>
+        <w:rFonts w:ascii="Tahoma" w:hAnsi="Tahoma" w:cs="Tahoma" w:hint="default"/>
       </w:rPr>
     </w:lvl>
     <w:lvl w:ilvl="2" w:tplc="04090005" w:tentative="1">
@@ -1955,7 +1955,7 @@
         <w:ind w:left="3600" w:hanging="360"/>
       </w:pPr>
       <w:rPr>
-        <w:rFonts w:ascii="Courier New" w:hAnsi="Courier New" w:cs="Courier New" w:hint="default"/>
+        <w:rFonts w:ascii="Tahoma" w:hAnsi="Tahoma" w:cs="Tahoma" w:hint="default"/>
       </w:rPr>
     </w:lvl>
     <w:lvl w:ilvl="5" w:tplc="04090005" w:tentative="1">
@@ -1991,7 +1991,7 @@
         <w:ind w:left="5760" w:hanging="360"/>
       </w:pPr>
       <w:rPr>
-        <w:rFonts w:ascii="Courier New" w:hAnsi="Courier New" w:cs="Courier New" w:hint="default"/>
+        <w:rFonts w:ascii="Tahoma" w:hAnsi="Tahoma" w:cs="Tahoma" w:hint="default"/>
       </w:rPr>
     </w:lvl>
     <w:lvl w:ilvl="8" w:tplc="04090005" w:tentative="1">
@@ -2039,7 +2039,7 @@
         <w:ind w:left="1440" w:hanging="360"/>
       </w:pPr>
       <w:rPr>
-        <w:rFonts w:ascii="Courier New" w:hAnsi="Courier New" w:hint="default"/>
+        <w:rFonts w:ascii="Tahoma" w:hAnsi="Tahoma" w:hint="default"/>
         <w:sz w:val="20"/>
       </w:rPr>
     </w:lvl>
@@ -2188,7 +2188,7 @@
         <w:ind w:left="1440" w:hanging="360"/>
       </w:pPr>
       <w:rPr>
-        <w:rFonts w:ascii="Courier New" w:hAnsi="Courier New" w:hint="default"/>
+        <w:rFonts w:ascii="Tahoma" w:hAnsi="Tahoma" w:hint="default"/>
         <w:sz w:val="20"/>
       </w:rPr>
     </w:lvl>
@@ -2330,7 +2330,7 @@
         <w:ind w:left="1440" w:hanging="360"/>
       </w:pPr>
       <w:rPr>
-        <w:rFonts w:ascii="Courier New" w:hAnsi="Courier New" w:cs="Courier New" w:hint="default"/>
+        <w:rFonts w:ascii="Tahoma" w:hAnsi="Tahoma" w:cs="Tahoma" w:hint="default"/>
       </w:rPr>
     </w:lvl>
     <w:lvl w:ilvl="2" w:tplc="04090005" w:tentative="1">
@@ -2366,7 +2366,7 @@
         <w:ind w:left="3600" w:hanging="360"/>
       </w:pPr>
       <w:rPr>
-        <w:rFonts w:ascii="Courier New" w:hAnsi="Courier New" w:cs="Courier New" w:hint="default"/>
+        <w:rFonts w:ascii="Tahoma" w:hAnsi="Tahoma" w:cs="Tahoma" w:hint="default"/>
       </w:rPr>
     </w:lvl>
     <w:lvl w:ilvl="5" w:tplc="04090005" w:tentative="1">
@@ -2402,7 +2402,7 @@
         <w:ind w:left="5760" w:hanging="360"/>
       </w:pPr>
       <w:rPr>
-        <w:rFonts w:ascii="Courier New" w:hAnsi="Courier New" w:cs="Courier New" w:hint="default"/>
+        <w:rFonts w:ascii="Tahoma" w:hAnsi="Tahoma" w:cs="Tahoma" w:hint="default"/>
       </w:rPr>
     </w:lvl>
     <w:lvl w:ilvl="8" w:tplc="04090005" w:tentative="1">
@@ -2438,10 +2438,10 @@
   <w:docDefaults>
     <w:rPrDefault>
       <w:rPr>
-        <w:rFonts w:asciiTheme="minorHAnsi" w:eastAsiaTheme="minorHAnsi" w:hAnsiTheme="minorHAnsi" w:cs="GE SS Text Medium"/>
+        <w:rFonts w:asciiTheme="minorHAnsi" w:eastAsiaTheme="minorHAnsi" w:hAnsiTheme="minorHAnsi" w:cs="Tahoma"/>
         <w:sz w:val="28"/>
         <w:szCs w:val="24"/>
-        <w:lang w:val="en-US" w:eastAsia="en-US" w:bidi="ar-SA"/>
+        <w:lang w:val="en-US" w:eastAsia="Tahoma" w:bidi="ar-SA"/>
       </w:rPr>
     </w:rPrDefault>
     <w:pPrDefault/>
@@ -2845,7 +2845,7 @@
       <w:outlineLvl w:val="2"/>
     </w:pPr>
     <w:rPr>
-      <w:rFonts w:ascii="Times New Roman" w:eastAsia="Times New Roman" w:hAnsi="Times New Roman" w:cs="Times New Roman"/>
+      <w:rFonts w:ascii="Tahoma" w:eastAsia="Tahoma" w:hAnsi="Tahoma" w:cs="Tahoma"/>
       <w:b/>
       <w:bCs/>
       <w:sz w:val="27"/>
@@ -2929,7 +2929,7 @@
       <w:autoSpaceDN w:val="0"/>
     </w:pPr>
     <w:rPr>
-      <w:rFonts w:ascii="Arial" w:eastAsia="Arial" w:hAnsi="Arial" w:cs="Arial"/>
+      <w:rFonts w:ascii="Tahoma" w:eastAsia="Tahoma" w:hAnsi="Tahoma" w:cs="Tahoma"/>
       <w:sz w:val="20"/>
       <w:szCs w:val="20"/>
     </w:rPr>
@@ -2941,7 +2941,7 @@
     <w:uiPriority w:val="1"/>
     <w:rsid w:val="00931962"/>
     <w:rPr>
-      <w:rFonts w:ascii="Arial" w:eastAsia="Arial" w:hAnsi="Arial" w:cs="Arial"/>
+      <w:rFonts w:ascii="Tahoma" w:eastAsia="Tahoma" w:hAnsi="Tahoma" w:cs="Tahoma"/>
       <w:sz w:val="20"/>
       <w:szCs w:val="20"/>
     </w:rPr>
@@ -3004,7 +3004,7 @@
       <w:spacing w:before="100" w:beforeAutospacing="1" w:after="100" w:afterAutospacing="1"/>
     </w:pPr>
     <w:rPr>
-      <w:rFonts w:ascii="Times New Roman" w:eastAsia="Times New Roman" w:hAnsi="Times New Roman" w:cs="Times New Roman"/>
+      <w:rFonts w:ascii="Tahoma" w:eastAsia="Tahoma" w:hAnsi="Tahoma" w:cs="Tahoma"/>
     </w:rPr>
   </w:style>
   <w:style w:type="character" w:customStyle="1" w:styleId="overflow-hidden">
@@ -3029,7 +3029,7 @@
     <w:uiPriority w:val="9"/>
     <w:rsid w:val="00C363A8"/>
     <w:rPr>
-      <w:rFonts w:ascii="Times New Roman" w:eastAsia="Times New Roman" w:hAnsi="Times New Roman" w:cs="Times New Roman"/>
+      <w:rFonts w:ascii="Tahoma" w:eastAsia="Tahoma" w:hAnsi="Tahoma" w:cs="Tahoma"/>
       <w:b/>
       <w:bCs/>
       <w:sz w:val="27"/>
@@ -3109,7 +3109,7 @@
     </a:clrScheme>
     <a:fontScheme name="Office">
       <a:majorFont>
-        <a:latin typeface="Calibri Light" panose="020F0302020204030204"/>
+        <a:latin typeface="Tahoma" panose="020F0302020204030204"/>
         <a:ea typeface=""/>
         <a:cs typeface=""/>
         <a:font script="Jpan" typeface="游ゴシック Light"/>
@@ -3161,7 +3161,7 @@
         <a:font script="Tfng" typeface="Ebrima"/>
       </a:majorFont>
       <a:minorFont>
-        <a:latin typeface="Calibri" panose="020F0502020204030204"/>
+        <a:latin typeface="Tahoma" panose="020F0502020204030204"/>
         <a:ea typeface=""/>
         <a:cs typeface=""/>
         <a:font script="Jpan" typeface="游明朝"/>

</xml_diff>